<commit_message>
feat: add real-time Ambulance Near Me module (/ambulance) with live tracking, provider adapter, and Maharashtra 36-district registry
</commit_message>
<xml_diff>
--- a/fiinalpitch.docx
+++ b/fiinalpitch.docx
@@ -1,6 +1,6 @@
 
 <file path=word/document.xml><?xml version="1.0" encoding="utf-8"?>
-<w:document xmlns:wpc="http://schemas.microsoft.com/office/word/2010/wordprocessingCanvas" xmlns:mc="http://schemas.openxmlformats.org/markup-compatibility/2006" xmlns:o="urn:schemas-microsoft-com:office:office" xmlns:r="http://schemas.openxmlformats.org/officeDocument/2006/relationships" xmlns:m="http://schemas.openxmlformats.org/officeDocument/2006/math" xmlns:v="urn:schemas-microsoft-com:vml" xmlns:wp14="http://schemas.microsoft.com/office/word/2010/wordprocessingDrawing" xmlns:wp="http://schemas.openxmlformats.org/drawingml/2006/wordprocessingDrawing" xmlns:w10="urn:schemas-microsoft-com:office:word" xmlns:w="http://schemas.openxmlformats.org/wordprocessingml/2006/main" xmlns:w14="http://schemas.microsoft.com/office/word/2010/wordml" xmlns:w15="http://schemas.microsoft.com/office/word/2012/wordml" xmlns:wpg="http://schemas.microsoft.com/office/word/2010/wordprocessingGroup" xmlns:wpi="http://schemas.microsoft.com/office/word/2010/wordprocessingInk" xmlns:wne="http://schemas.microsoft.com/office/word/2006/wordml" xmlns:wps="http://schemas.microsoft.com/office/word/2010/wordprocessingShape" xmlns:cx="http://schemas.microsoft.com/office/drawing/2014/chartex" xmlns:cx1="http://schemas.microsoft.com/office/drawing/2015/9/8/chartex" xmlns:cx2="http://schemas.microsoft.com/office/drawing/2015/10/21/chartex" xmlns:cx3="http://schemas.microsoft.com/office/drawing/2016/5/9/chartex" xmlns:cx4="http://schemas.microsoft.com/office/drawing/2016/5/10/chartex" xmlns:cx5="http://schemas.microsoft.com/office/drawing/2016/5/11/chartex" xmlns:cx6="http://schemas.microsoft.com/office/drawing/2016/5/12/chartex" xmlns:cx7="http://schemas.microsoft.com/office/drawing/2016/5/13/chartex" xmlns:cx8="http://schemas.microsoft.com/office/drawing/2016/5/14/chartex" xmlns:aink="http://schemas.microsoft.com/office/drawing/2016/ink" xmlns:am3d="http://schemas.microsoft.com/office/drawing/2017/model3d" xmlns:w16cex="http://schemas.microsoft.com/office/word/2018/wordml/cex" xmlns:w16cid="http://schemas.microsoft.com/office/word/2016/wordml/cid" xmlns:w16="http://schemas.microsoft.com/office/word/2018/wordml" xmlns:w16sdtdh="http://schemas.microsoft.com/office/word/2020/wordml/sdtdatahash" xmlns:w16se="http://schemas.microsoft.com/office/word/2015/wordml/symex" mc:Ignorable="w14 w15 wp14">
+<w:document xmlns:wpc="http://schemas.microsoft.com/office/word/2010/wordprocessingCanvas" xmlns:cx="http://schemas.microsoft.com/office/drawing/2014/chartex" xmlns:cx1="http://schemas.microsoft.com/office/drawing/2015/9/8/chartex" xmlns:cx2="http://schemas.microsoft.com/office/drawing/2015/10/21/chartex" xmlns:cx3="http://schemas.microsoft.com/office/drawing/2016/5/9/chartex" xmlns:cx4="http://schemas.microsoft.com/office/drawing/2016/5/10/chartex" xmlns:cx5="http://schemas.microsoft.com/office/drawing/2016/5/11/chartex" xmlns:cx6="http://schemas.microsoft.com/office/drawing/2016/5/12/chartex" xmlns:cx7="http://schemas.microsoft.com/office/drawing/2016/5/13/chartex" xmlns:cx8="http://schemas.microsoft.com/office/drawing/2016/5/14/chartex" xmlns:mc="http://schemas.openxmlformats.org/markup-compatibility/2006" xmlns:aink="http://schemas.microsoft.com/office/drawing/2016/ink" xmlns:am3d="http://schemas.microsoft.com/office/drawing/2017/model3d" xmlns:o="urn:schemas-microsoft-com:office:office" xmlns:oel="http://schemas.microsoft.com/office/2019/extlst" xmlns:r="http://schemas.openxmlformats.org/officeDocument/2006/relationships" xmlns:m="http://schemas.openxmlformats.org/officeDocument/2006/math" xmlns:v="urn:schemas-microsoft-com:vml" xmlns:wp14="http://schemas.microsoft.com/office/word/2010/wordprocessingDrawing" xmlns:wp="http://schemas.openxmlformats.org/drawingml/2006/wordprocessingDrawing" xmlns:w10="urn:schemas-microsoft-com:office:word" xmlns:w="http://schemas.openxmlformats.org/wordprocessingml/2006/main" xmlns:w14="http://schemas.microsoft.com/office/word/2010/wordml" xmlns:w15="http://schemas.microsoft.com/office/word/2012/wordml" xmlns:w16cex="http://schemas.microsoft.com/office/word/2018/wordml/cex" xmlns:w16cid="http://schemas.microsoft.com/office/word/2016/wordml/cid" xmlns:w16="http://schemas.microsoft.com/office/word/2018/wordml" xmlns:w16du="http://schemas.microsoft.com/office/word/2023/wordml/word16du" xmlns:w16sdtdh="http://schemas.microsoft.com/office/word/2020/wordml/sdtdatahash" xmlns:w16sdtfl="http://schemas.microsoft.com/office/word/2024/wordml/sdtformatlock" xmlns:w16se="http://schemas.microsoft.com/office/word/2015/wordml/symex" xmlns:wpg="http://schemas.microsoft.com/office/word/2010/wordprocessingGroup" xmlns:wpi="http://schemas.microsoft.com/office/word/2010/wordprocessingInk" xmlns:wne="http://schemas.microsoft.com/office/word/2006/wordml" xmlns:wps="http://schemas.microsoft.com/office/word/2010/wordprocessingShape" mc:Ignorable="w14 w15 w16se w16cid w16 w16cex w16sdtdh w16sdtfl w16du wp14">
   <w:body>
     <w:p>
       <w:pPr>
@@ -9,14 +9,13 @@
       </w:pPr>
       <w:r>
         <w:rPr>
-          <w:rFonts w:ascii="Segoe UI" w:cs="Segoe UI" w:eastAsia="Segoe UI" w:hAnsi="Segoe UI"/>
           <w:b/>
           <w:bCs/>
           <w:color w:val="0284C7"/>
           <w:sz w:val="24"/>
           <w:szCs w:val="24"/>
         </w:rPr>
-        <w:t xml:space="preserve">SMART INDIA HACKATHON 2026</w:t>
+        <w:t>SMART INDIA HACKATHON 2026</w:t>
       </w:r>
     </w:p>
     <w:p>
@@ -26,14 +25,33 @@
       </w:pPr>
       <w:r>
         <w:rPr>
-          <w:rFonts w:ascii="Segoe UI" w:cs="Segoe UI" w:eastAsia="Segoe UI" w:hAnsi="Segoe UI"/>
           <w:b/>
           <w:bCs/>
           <w:color w:val="134E4A"/>
           <w:sz w:val="34"/>
           <w:szCs w:val="34"/>
         </w:rPr>
-        <w:t xml:space="preserve">🎤 Universal Pitch Script — Team PBCOE_EKATVA</w:t>
+        <w:t xml:space="preserve">🎤 </w:t>
+      </w:r>
+      <w:r>
+        <w:rPr>
+          <w:b/>
+          <w:bCs/>
+          <w:color w:val="134E4A"/>
+          <w:sz w:val="34"/>
+          <w:szCs w:val="34"/>
+        </w:rPr>
+        <w:t xml:space="preserve">Final </w:t>
+      </w:r>
+      <w:r>
+        <w:rPr>
+          <w:b/>
+          <w:bCs/>
+          <w:color w:val="134E4A"/>
+          <w:sz w:val="34"/>
+          <w:szCs w:val="34"/>
+        </w:rPr>
+        <w:t>Pitch Script — Team PBCOE_EKATVA</w:t>
       </w:r>
     </w:p>
     <w:p>
@@ -43,257 +61,260 @@
       </w:pPr>
       <w:r>
         <w:rPr>
-          <w:rFonts w:ascii="Segoe UI" w:cs="Segoe UI" w:eastAsia="Segoe UI" w:hAnsi="Segoe UI"/>
           <w:color w:val="475569"/>
           <w:sz w:val="19"/>
           <w:szCs w:val="19"/>
         </w:rPr>
-        <w:t xml:space="preserve">Project: JeevanSetu (HealthcareBridge) | Problem Statement ID: 26133
-Govt. of Maharashtra (MSInS, Dept. of Skills, Employment &amp; Innovation)</w:t>
+        <w:t>Project: JeevanSetu (HealthcareBridge) | Problem Statement ID: 26133 Govt. of Maharashtra (MSInS, Dept. of Skills, Employment &amp; Innovation)</w:t>
       </w:r>
     </w:p>
     <w:tbl>
       <w:tblPr>
-        <w:tblW w:type="pct" w:w="100%"/>
+        <w:tblW w:w="5000" w:type="pct"/>
         <w:tblBorders>
-          <w:top w:val="single" w:color="auto" w:sz="4"/>
-          <w:left w:val="single" w:color="auto" w:sz="4"/>
-          <w:bottom w:val="single" w:color="auto" w:sz="4"/>
-          <w:right w:val="single" w:color="auto" w:sz="4"/>
-          <w:insideH w:val="single" w:color="auto" w:sz="4"/>
-          <w:insideV w:val="single" w:color="auto" w:sz="4"/>
+          <w:top w:val="single" w:sz="4" w:space="0" w:color="auto"/>
+          <w:left w:val="single" w:sz="4" w:space="0" w:color="auto"/>
+          <w:bottom w:val="single" w:sz="4" w:space="0" w:color="auto"/>
+          <w:right w:val="single" w:sz="4" w:space="0" w:color="auto"/>
+          <w:insideH w:val="single" w:sz="4" w:space="0" w:color="auto"/>
+          <w:insideV w:val="single" w:sz="4" w:space="0" w:color="auto"/>
         </w:tblBorders>
+        <w:tblCellMar>
+          <w:left w:w="10" w:type="dxa"/>
+          <w:right w:w="10" w:type="dxa"/>
+        </w:tblCellMar>
+        <w:tblLook w:val="0000" w:firstRow="0" w:lastRow="0" w:firstColumn="0" w:lastColumn="0" w:noHBand="0" w:noVBand="0"/>
       </w:tblPr>
       <w:tblGrid>
-        <w:gridCol w:w="100"/>
-        <w:gridCol w:w="100"/>
+        <w:gridCol w:w="2969"/>
+        <w:gridCol w:w="6927"/>
       </w:tblGrid>
       <w:tr>
+        <w:tblPrEx>
+          <w:tblCellMar>
+            <w:top w:w="0" w:type="dxa"/>
+            <w:bottom w:w="0" w:type="dxa"/>
+          </w:tblCellMar>
+        </w:tblPrEx>
         <w:tc>
           <w:tcPr>
-            <w:tcW w:type="pct" w:w="30%"/>
-            <w:shd w:fill="0F766E" w:val="clear"/>
+            <w:tcW w:w="1500" w:type="pct"/>
+            <w:shd w:val="clear" w:color="auto" w:fill="0F766E"/>
           </w:tcPr>
           <w:p>
             <w:r>
               <w:rPr>
-                <w:rFonts w:ascii="Segoe UI" w:cs="Segoe UI" w:eastAsia="Segoe UI" w:hAnsi="Segoe UI"/>
                 <w:b/>
                 <w:bCs/>
                 <w:color w:val="FFFFFF"/>
-                <w:sz w:val="20"/>
-                <w:szCs w:val="20"/>
               </w:rPr>
-              <w:t xml:space="preserve">Parameter</w:t>
+              <w:t>Parameter</w:t>
             </w:r>
           </w:p>
         </w:tc>
         <w:tc>
           <w:tcPr>
-            <w:tcW w:type="pct" w:w="70%"/>
-            <w:shd w:fill="0F766E" w:val="clear"/>
+            <w:tcW w:w="3500" w:type="pct"/>
+            <w:shd w:val="clear" w:color="auto" w:fill="0F766E"/>
           </w:tcPr>
           <w:p>
             <w:r>
               <w:rPr>
-                <w:rFonts w:ascii="Segoe UI" w:cs="Segoe UI" w:eastAsia="Segoe UI" w:hAnsi="Segoe UI"/>
                 <w:b/>
                 <w:bCs/>
                 <w:color w:val="FFFFFF"/>
-                <w:sz w:val="20"/>
-                <w:szCs w:val="20"/>
               </w:rPr>
-              <w:t xml:space="preserve">Official Submission Detail</w:t>
+              <w:t>Official Submission Detail</w:t>
             </w:r>
           </w:p>
         </w:tc>
       </w:tr>
       <w:tr>
+        <w:tblPrEx>
+          <w:tblCellMar>
+            <w:top w:w="0" w:type="dxa"/>
+            <w:bottom w:w="0" w:type="dxa"/>
+          </w:tblCellMar>
+        </w:tblPrEx>
         <w:tc>
           <w:tcPr>
-            <w:tcW w:type="pct" w:w="30%"/>
+            <w:tcW w:w="1500" w:type="pct"/>
           </w:tcPr>
           <w:p>
             <w:r>
               <w:rPr>
-                <w:rFonts w:ascii="Segoe UI" w:cs="Segoe UI" w:eastAsia="Segoe UI" w:hAnsi="Segoe UI"/>
                 <w:b/>
                 <w:bCs/>
-                <w:color w:val="0F172A"/>
                 <w:sz w:val="19"/>
                 <w:szCs w:val="19"/>
               </w:rPr>
-              <w:t xml:space="preserve">Problem Statement ID</w:t>
+              <w:t>Problem Statement ID</w:t>
             </w:r>
           </w:p>
         </w:tc>
         <w:tc>
           <w:tcPr>
-            <w:tcW w:type="pct" w:w="70%"/>
+            <w:tcW w:w="3500" w:type="pct"/>
           </w:tcPr>
           <w:p>
             <w:r>
               <w:rPr>
-                <w:rFonts w:ascii="Segoe UI" w:cs="Segoe UI" w:eastAsia="Segoe UI" w:hAnsi="Segoe UI"/>
-                <w:b w:val="false"/>
-                <w:bCs w:val="false"/>
-                <w:color w:val="0F172A"/>
                 <w:sz w:val="19"/>
                 <w:szCs w:val="19"/>
               </w:rPr>
-              <w:t xml:space="preserve">26133 (Govt. of Maharashtra - MSInS)</w:t>
+              <w:t>26133 (Govt. of Maharashtra - MSInS)</w:t>
             </w:r>
           </w:p>
         </w:tc>
       </w:tr>
       <w:tr>
+        <w:tblPrEx>
+          <w:tblCellMar>
+            <w:top w:w="0" w:type="dxa"/>
+            <w:bottom w:w="0" w:type="dxa"/>
+          </w:tblCellMar>
+        </w:tblPrEx>
         <w:tc>
           <w:tcPr>
-            <w:tcW w:type="pct" w:w="30%"/>
+            <w:tcW w:w="1500" w:type="pct"/>
           </w:tcPr>
           <w:p>
             <w:r>
               <w:rPr>
-                <w:rFonts w:ascii="Segoe UI" w:cs="Segoe UI" w:eastAsia="Segoe UI" w:hAnsi="Segoe UI"/>
                 <w:b/>
                 <w:bCs/>
-                <w:color w:val="0F172A"/>
                 <w:sz w:val="19"/>
                 <w:szCs w:val="19"/>
               </w:rPr>
-              <w:t xml:space="preserve">Problem Statement Title</w:t>
+              <w:t>Problem Statement Title</w:t>
             </w:r>
           </w:p>
         </w:tc>
         <w:tc>
           <w:tcPr>
-            <w:tcW w:type="pct" w:w="70%"/>
+            <w:tcW w:w="3500" w:type="pct"/>
           </w:tcPr>
           <w:p>
             <w:r>
               <w:rPr>
-                <w:rFonts w:ascii="Segoe UI" w:cs="Segoe UI" w:eastAsia="Segoe UI" w:hAnsi="Segoe UI"/>
-                <w:b w:val="false"/>
-                <w:bCs w:val="false"/>
-                <w:color w:val="0F172A"/>
                 <w:sz w:val="19"/>
                 <w:szCs w:val="19"/>
               </w:rPr>
-              <w:t xml:space="preserve">Accessibility and quality of public healthcare services, particularly in rural and underserved areas</w:t>
+              <w:t>Accessibility and quality of public healthcare services, particularly in rural and underserved areas</w:t>
             </w:r>
           </w:p>
         </w:tc>
       </w:tr>
       <w:tr>
+        <w:tblPrEx>
+          <w:tblCellMar>
+            <w:top w:w="0" w:type="dxa"/>
+            <w:bottom w:w="0" w:type="dxa"/>
+          </w:tblCellMar>
+        </w:tblPrEx>
         <w:tc>
           <w:tcPr>
-            <w:tcW w:type="pct" w:w="30%"/>
+            <w:tcW w:w="1500" w:type="pct"/>
           </w:tcPr>
           <w:p>
             <w:r>
               <w:rPr>
-                <w:rFonts w:ascii="Segoe UI" w:cs="Segoe UI" w:eastAsia="Segoe UI" w:hAnsi="Segoe UI"/>
                 <w:b/>
                 <w:bCs/>
-                <w:color w:val="0F172A"/>
                 <w:sz w:val="19"/>
                 <w:szCs w:val="19"/>
               </w:rPr>
-              <w:t xml:space="preserve">Theme &amp; Category</w:t>
+              <w:t>Theme &amp; Category</w:t>
             </w:r>
           </w:p>
         </w:tc>
         <w:tc>
           <w:tcPr>
-            <w:tcW w:type="pct" w:w="70%"/>
+            <w:tcW w:w="3500" w:type="pct"/>
           </w:tcPr>
           <w:p>
             <w:r>
               <w:rPr>
-                <w:rFonts w:ascii="Segoe UI" w:cs="Segoe UI" w:eastAsia="Segoe UI" w:hAnsi="Segoe UI"/>
-                <w:b w:val="false"/>
-                <w:bCs w:val="false"/>
-                <w:color w:val="0F172A"/>
                 <w:sz w:val="19"/>
                 <w:szCs w:val="19"/>
               </w:rPr>
-              <w:t xml:space="preserve">MedTech / BioTech / HealthTech  |  Software</w:t>
+              <w:t>MedTech / BioTech / HealthTech  |  Software</w:t>
             </w:r>
           </w:p>
         </w:tc>
       </w:tr>
       <w:tr>
+        <w:tblPrEx>
+          <w:tblCellMar>
+            <w:top w:w="0" w:type="dxa"/>
+            <w:bottom w:w="0" w:type="dxa"/>
+          </w:tblCellMar>
+        </w:tblPrEx>
         <w:tc>
           <w:tcPr>
-            <w:tcW w:type="pct" w:w="30%"/>
+            <w:tcW w:w="1500" w:type="pct"/>
           </w:tcPr>
           <w:p>
             <w:r>
               <w:rPr>
-                <w:rFonts w:ascii="Segoe UI" w:cs="Segoe UI" w:eastAsia="Segoe UI" w:hAnsi="Segoe UI"/>
                 <w:b/>
                 <w:bCs/>
-                <w:color w:val="0F172A"/>
                 <w:sz w:val="19"/>
                 <w:szCs w:val="19"/>
               </w:rPr>
-              <w:t xml:space="preserve">Team Name &amp; College</w:t>
+              <w:t>Team Name &amp; College</w:t>
             </w:r>
           </w:p>
         </w:tc>
         <w:tc>
           <w:tcPr>
-            <w:tcW w:type="pct" w:w="70%"/>
+            <w:tcW w:w="3500" w:type="pct"/>
           </w:tcPr>
           <w:p>
             <w:r>
               <w:rPr>
-                <w:rFonts w:ascii="Segoe UI" w:cs="Segoe UI" w:eastAsia="Segoe UI" w:hAnsi="Segoe UI"/>
-                <w:b w:val="false"/>
-                <w:bCs w:val="false"/>
-                <w:color w:val="0F172A"/>
                 <w:sz w:val="19"/>
                 <w:szCs w:val="19"/>
               </w:rPr>
-              <w:t xml:space="preserve">PBCOE_EKATVA — Priyadarshini Bhagwati College of Engineering, Nagpur</w:t>
+              <w:t>PBCOE_EKATVA — Priyadarshini Bhagwati College of Engineering, Nagpur</w:t>
             </w:r>
           </w:p>
         </w:tc>
       </w:tr>
       <w:tr>
+        <w:tblPrEx>
+          <w:tblCellMar>
+            <w:top w:w="0" w:type="dxa"/>
+            <w:bottom w:w="0" w:type="dxa"/>
+          </w:tblCellMar>
+        </w:tblPrEx>
         <w:tc>
           <w:tcPr>
-            <w:tcW w:type="pct" w:w="30%"/>
+            <w:tcW w:w="1500" w:type="pct"/>
           </w:tcPr>
           <w:p>
             <w:r>
               <w:rPr>
-                <w:rFonts w:ascii="Segoe UI" w:cs="Segoe UI" w:eastAsia="Segoe UI" w:hAnsi="Segoe UI"/>
                 <w:b/>
                 <w:bCs/>
-                <w:color w:val="0F172A"/>
                 <w:sz w:val="19"/>
                 <w:szCs w:val="19"/>
               </w:rPr>
-              <w:t xml:space="preserve">Total Pitch Duration</w:t>
+              <w:t>Total Pitch Duration</w:t>
             </w:r>
           </w:p>
         </w:tc>
         <w:tc>
           <w:tcPr>
-            <w:tcW w:type="pct" w:w="70%"/>
+            <w:tcW w:w="3500" w:type="pct"/>
           </w:tcPr>
           <w:p>
             <w:r>
               <w:rPr>
-                <w:rFonts w:ascii="Segoe UI" w:cs="Segoe UI" w:eastAsia="Segoe UI" w:hAnsi="Segoe UI"/>
-                <w:b w:val="false"/>
-                <w:bCs w:val="false"/>
-                <w:color w:val="0F172A"/>
                 <w:sz w:val="19"/>
                 <w:szCs w:val="19"/>
               </w:rPr>
-              <w:t xml:space="preserve">4 Minutes 30 Seconds Pitch + 30 Seconds Buffer + Judge Q&amp;A</w:t>
+              <w:t>4 Minutes 30 Seconds Pitch + 30 Seconds Buffer + Judge Q&amp;A</w:t>
             </w:r>
           </w:p>
         </w:tc>
@@ -301,18 +322,17 @@
     </w:tbl>
     <w:p>
       <w:pPr>
-        <w:spacing w:after="150" w:before="200"/>
-      </w:pPr>
-      <w:r>
-        <w:rPr>
-          <w:rFonts w:ascii="Segoe UI" w:cs="Segoe UI" w:eastAsia="Segoe UI" w:hAnsi="Segoe UI"/>
+        <w:spacing w:before="200" w:after="150"/>
+      </w:pPr>
+      <w:r>
+        <w:rPr>
           <w:b/>
           <w:bCs/>
           <w:color w:val="134E4A"/>
           <w:sz w:val="22"/>
           <w:szCs w:val="22"/>
         </w:rPr>
-        <w:t xml:space="preserve">📌 Instructions for the Team:</w:t>
+        <w:t>📌 Instructions for the Team:</w:t>
       </w:r>
     </w:p>
     <w:p>
@@ -322,11 +342,10 @@
           <w:ilvl w:val="0"/>
           <w:numId w:val="1"/>
         </w:numPr>
-        <w:spacing w:after="120" w:line="276"/>
-      </w:pPr>
-      <w:r>
-        <w:rPr>
-          <w:rFonts w:ascii="Segoe UI" w:cs="Segoe UI" w:eastAsia="Segoe UI" w:hAnsi="Segoe UI"/>
+        <w:spacing w:after="120" w:line="276" w:lineRule="auto"/>
+      </w:pPr>
+      <w:r>
+        <w:rPr>
           <w:b/>
           <w:bCs/>
           <w:color w:val="134E4A"/>
@@ -337,12 +356,10 @@
       </w:r>
       <w:r>
         <w:rPr>
-          <w:rFonts w:ascii="Segoe UI" w:cs="Segoe UI" w:eastAsia="Segoe UI" w:hAnsi="Segoe UI"/>
-          <w:color w:val="0F172A"/>
-          <w:sz w:val="21"/>
-          <w:szCs w:val="21"/>
-        </w:rPr>
-        <w:t xml:space="preserve">Speak clearly, maintain eye contact with judges, and avoid filler words. Every word in this script is concise and high-impact.</w:t>
+          <w:sz w:val="21"/>
+          <w:szCs w:val="21"/>
+        </w:rPr>
+        <w:t>Speak clearly, maintain eye contact with judges, and avoid filler words. Every word in this script is concise and high-impact.</w:t>
       </w:r>
     </w:p>
     <w:p>
@@ -352,11 +369,10 @@
           <w:ilvl w:val="0"/>
           <w:numId w:val="1"/>
         </w:numPr>
-        <w:spacing w:after="120" w:line="276"/>
-      </w:pPr>
-      <w:r>
-        <w:rPr>
-          <w:rFonts w:ascii="Segoe UI" w:cs="Segoe UI" w:eastAsia="Segoe UI" w:hAnsi="Segoe UI"/>
+        <w:spacing w:after="120" w:line="276" w:lineRule="auto"/>
+      </w:pPr>
+      <w:r>
+        <w:rPr>
           <w:b/>
           <w:bCs/>
           <w:color w:val="134E4A"/>
@@ -367,12 +383,10 @@
       </w:r>
       <w:r>
         <w:rPr>
-          <w:rFonts w:ascii="Segoe UI" w:cs="Segoe UI" w:eastAsia="Segoe UI" w:hAnsi="Segoe UI"/>
-          <w:color w:val="0F172A"/>
-          <w:sz w:val="21"/>
-          <w:szCs w:val="21"/>
-        </w:rPr>
-        <w:t xml:space="preserve">Every single team member has an assigned slide to speak so the judges see 100% team synergy and cross-domain mastery.</w:t>
+          <w:sz w:val="21"/>
+          <w:szCs w:val="21"/>
+        </w:rPr>
+        <w:t>Every single team member has an assigned slide to speak so the judges see 100% team synergy and cross-domain mastery.</w:t>
       </w:r>
     </w:p>
     <w:p>
@@ -382,11 +396,10 @@
           <w:ilvl w:val="0"/>
           <w:numId w:val="1"/>
         </w:numPr>
-        <w:spacing w:after="120" w:line="276"/>
-      </w:pPr>
-      <w:r>
-        <w:rPr>
-          <w:rFonts w:ascii="Segoe UI" w:cs="Segoe UI" w:eastAsia="Segoe UI" w:hAnsi="Segoe UI"/>
+        <w:spacing w:after="120" w:line="276" w:lineRule="auto"/>
+      </w:pPr>
+      <w:r>
+        <w:rPr>
           <w:b/>
           <w:bCs/>
           <w:color w:val="134E4A"/>
@@ -397,67 +410,71 @@
       </w:r>
       <w:r>
         <w:rPr>
-          <w:rFonts w:ascii="Segoe UI" w:cs="Segoe UI" w:eastAsia="Segoe UI" w:hAnsi="Segoe UI"/>
-          <w:color w:val="0F172A"/>
-          <w:sz w:val="21"/>
-          <w:szCs w:val="21"/>
-        </w:rPr>
-        <w:t xml:space="preserve">When moving to the next speaker, use the natural handover cues provided at the bottom of each slide section.</w:t>
+          <w:sz w:val="21"/>
+          <w:szCs w:val="21"/>
+        </w:rPr>
+        <w:t>When moving to the next speaker, use the natural handover cues provided at the bottom of each slide section.</w:t>
       </w:r>
     </w:p>
     <w:p>
       <w:pPr>
         <w:pStyle w:val="Heading1"/>
-        <w:spacing w:after="150" w:before="300"/>
-      </w:pPr>
-      <w:r>
-        <w:rPr>
-          <w:rFonts w:ascii="Segoe UI" w:cs="Segoe UI" w:eastAsia="Segoe UI" w:hAnsi="Segoe UI"/>
+        <w:spacing w:before="300" w:after="150"/>
+      </w:pPr>
+      <w:r>
+        <w:rPr>
           <w:b/>
           <w:bCs/>
           <w:color w:val="134E4A"/>
           <w:sz w:val="26"/>
           <w:szCs w:val="26"/>
         </w:rPr>
-        <w:t xml:space="preserve">SLIDE 1: TITLE PAGE (INTRODUCTION)</w:t>
+        <w:t>SLIDE 1: TITLE PAGE (INTRODUCTION)</w:t>
       </w:r>
     </w:p>
     <w:tbl>
       <w:tblPr>
-        <w:tblW w:type="pct" w:w="100%"/>
+        <w:tblW w:w="5000" w:type="pct"/>
         <w:tblBorders>
-          <w:top w:val="none" w:color="auto" w:sz="0"/>
-          <w:left w:val="single" w:color="0F766E" w:sz="12"/>
-          <w:bottom w:val="single" w:color="0F766E" w:sz="4"/>
-          <w:right w:val="none" w:color="auto" w:sz="0"/>
-          <w:insideH w:val="single" w:color="auto" w:sz="4"/>
-          <w:insideV w:val="single" w:color="auto" w:sz="4"/>
+          <w:left w:val="single" w:sz="12" w:space="0" w:color="0F766E"/>
+          <w:bottom w:val="single" w:sz="4" w:space="0" w:color="0F766E"/>
+          <w:insideH w:val="single" w:sz="4" w:space="0" w:color="auto"/>
+          <w:insideV w:val="single" w:sz="4" w:space="0" w:color="auto"/>
         </w:tblBorders>
+        <w:tblCellMar>
+          <w:left w:w="10" w:type="dxa"/>
+          <w:right w:w="10" w:type="dxa"/>
+        </w:tblCellMar>
+        <w:tblLook w:val="0000" w:firstRow="0" w:lastRow="0" w:firstColumn="0" w:lastColumn="0" w:noHBand="0" w:noVBand="0"/>
       </w:tblPr>
       <w:tblGrid>
-        <w:gridCol w:w="100"/>
+        <w:gridCol w:w="9891"/>
       </w:tblGrid>
       <w:tr>
+        <w:tblPrEx>
+          <w:tblCellMar>
+            <w:top w:w="0" w:type="dxa"/>
+            <w:bottom w:w="0" w:type="dxa"/>
+          </w:tblCellMar>
+        </w:tblPrEx>
         <w:tc>
           <w:tcPr>
-            <w:tcW w:type="pct" w:w="100%"/>
-            <w:shd w:fill="F0FDFA" w:val="clear"/>
+            <w:tcW w:w="5000" w:type="pct"/>
+            <w:shd w:val="clear" w:color="auto" w:fill="F0FDFA"/>
           </w:tcPr>
           <w:p>
             <w:r>
               <w:rPr>
-                <w:rFonts w:ascii="Segoe UI" w:cs="Segoe UI" w:eastAsia="Segoe UI" w:hAnsi="Segoe UI"/>
                 <w:b/>
                 <w:bCs/>
                 <w:color w:val="134E4A"/>
                 <w:sz w:val="22"/>
                 <w:szCs w:val="22"/>
               </w:rPr>
-              <w:t xml:space="preserve">🎤 SPEAKER 1 (Team Leader / Project Lead)</w:t>
+              <w:t>🎤 SPEAKER 1 (Team Leader / Project Lead)</w:t>
             </w:r>
             <w:r>
               <w:rPr>
-                <w:rFonts w:ascii="Segoe UI" w:cs="Segoe UI" w:eastAsia="Segoe UI" w:hAnsi="Segoe UI"/>
                 <w:b/>
                 <w:bCs/>
                 <w:color w:val="0284C7"/>
@@ -472,17 +489,15 @@
     </w:tbl>
     <w:p>
       <w:pPr>
-        <w:spacing w:after="50" w:before="100"/>
-      </w:pPr>
-      <w:r>
-        <w:rPr>
-          <w:b/>
-          <w:bCs/>
-          <w:color w:val="134E4A"/>
-          <w:sz w:val="20"/>
-          <w:szCs w:val="20"/>
-        </w:rPr>
-        <w:t xml:space="preserve">Spoken Script:</w:t>
+        <w:spacing w:before="100" w:after="50"/>
+      </w:pPr>
+      <w:r>
+        <w:rPr>
+          <w:b/>
+          <w:bCs/>
+          <w:color w:val="134E4A"/>
+        </w:rPr>
+        <w:t>Spoken Script:</w:t>
       </w:r>
     </w:p>
     <w:p>
@@ -492,11 +507,10 @@
           <w:ilvl w:val="0"/>
           <w:numId w:val="1"/>
         </w:numPr>
-        <w:spacing w:after="120" w:line="276"/>
-      </w:pPr>
-      <w:r>
-        <w:rPr>
-          <w:rFonts w:ascii="Segoe UI" w:cs="Segoe UI" w:eastAsia="Segoe UI" w:hAnsi="Segoe UI"/>
+        <w:spacing w:after="120" w:line="276" w:lineRule="auto"/>
+      </w:pPr>
+      <w:r>
+        <w:rPr>
           <w:b/>
           <w:bCs/>
           <w:color w:val="134E4A"/>
@@ -507,12 +521,10 @@
       </w:r>
       <w:r>
         <w:rPr>
-          <w:rFonts w:ascii="Segoe UI" w:cs="Segoe UI" w:eastAsia="Segoe UI" w:hAnsi="Segoe UI"/>
-          <w:color w:val="0F172A"/>
-          <w:sz w:val="21"/>
-          <w:szCs w:val="21"/>
-        </w:rPr>
-        <w:t xml:space="preserve">“Good [morning/afternoon], respected judges. We are Team PBCOE_EKATVA, presenting our solution for Problem Statement 26133 under the MedTech and HealthTech theme.”</w:t>
+          <w:sz w:val="21"/>
+          <w:szCs w:val="21"/>
+        </w:rPr>
+        <w:t>“Good [morning/afternoon], respected judges. We are Team PBCOE_EKATVA, presenting our solution for Problem Statement 26133 under the MedTech and HealthTech theme.”</w:t>
       </w:r>
     </w:p>
     <w:p>
@@ -522,11 +534,10 @@
           <w:ilvl w:val="0"/>
           <w:numId w:val="1"/>
         </w:numPr>
-        <w:spacing w:after="120" w:line="276"/>
-      </w:pPr>
-      <w:r>
-        <w:rPr>
-          <w:rFonts w:ascii="Segoe UI" w:cs="Segoe UI" w:eastAsia="Segoe UI" w:hAnsi="Segoe UI"/>
+        <w:spacing w:after="120" w:line="276" w:lineRule="auto"/>
+      </w:pPr>
+      <w:r>
+        <w:rPr>
           <w:b/>
           <w:bCs/>
           <w:color w:val="134E4A"/>
@@ -537,12 +548,10 @@
       </w:r>
       <w:r>
         <w:rPr>
-          <w:rFonts w:ascii="Segoe UI" w:cs="Segoe UI" w:eastAsia="Segoe UI" w:hAnsi="Segoe UI"/>
-          <w:color w:val="0F172A"/>
-          <w:sz w:val="21"/>
-          <w:szCs w:val="21"/>
-        </w:rPr>
-        <w:t xml:space="preserve">“Our problem statement is issued by the Government of Maharashtra, under the Maharashtra State Innovation Society, addressing the critical challenge of accessibility and quality of public healthcare in rural and underserved areas.”</w:t>
+          <w:sz w:val="21"/>
+          <w:szCs w:val="21"/>
+        </w:rPr>
+        <w:t>“Our problem statement is issued by the Government of Maharashtra, under the Maharashtra State Innovation Society, addressing the critical challenge of accessibility and quality of public healthcare in rural and underserved areas.”</w:t>
       </w:r>
     </w:p>
     <w:p>
@@ -552,11 +561,10 @@
           <w:ilvl w:val="0"/>
           <w:numId w:val="1"/>
         </w:numPr>
-        <w:spacing w:after="120" w:line="276"/>
-      </w:pPr>
-      <w:r>
-        <w:rPr>
-          <w:rFonts w:ascii="Segoe UI" w:cs="Segoe UI" w:eastAsia="Segoe UI" w:hAnsi="Segoe UI"/>
+        <w:spacing w:after="120" w:line="276" w:lineRule="auto"/>
+      </w:pPr>
+      <w:r>
+        <w:rPr>
           <w:b/>
           <w:bCs/>
           <w:color w:val="134E4A"/>
@@ -567,21 +575,18 @@
       </w:r>
       <w:r>
         <w:rPr>
-          <w:rFonts w:ascii="Segoe UI" w:cs="Segoe UI" w:eastAsia="Segoe UI" w:hAnsi="Segoe UI"/>
-          <w:color w:val="0F172A"/>
-          <w:sz w:val="21"/>
-          <w:szCs w:val="21"/>
-        </w:rPr>
-        <w:t xml:space="preserve">“Our project is called JeevanSetu — HealthcareBridge: an intelligent, non-diagnostic coordination platform designed to bridge rural citizens to verified, life-saving public healthcare.”</w:t>
-      </w:r>
-    </w:p>
-    <w:p>
-      <w:pPr>
-        <w:spacing w:after="200" w:before="100"/>
-      </w:pPr>
-      <w:r>
-        <w:rPr>
-          <w:rFonts w:ascii="Segoe UI" w:cs="Segoe UI" w:eastAsia="Segoe UI" w:hAnsi="Segoe UI"/>
+          <w:sz w:val="21"/>
+          <w:szCs w:val="21"/>
+        </w:rPr>
+        <w:t>“Our project is called JeevanSetu — HealthcareBridge: an intelligent, non-diagnostic coordination platform designed to bridge rural citizens to verified, life-saving public healthcare.”</w:t>
+      </w:r>
+    </w:p>
+    <w:p>
+      <w:pPr>
+        <w:spacing w:before="100" w:after="200"/>
+      </w:pPr>
+      <w:r>
+        <w:rPr>
           <w:b/>
           <w:bCs/>
           <w:color w:val="0284C7"/>
@@ -592,69 +597,74 @@
       </w:r>
       <w:r>
         <w:rPr>
-          <w:rFonts w:ascii="Segoe UI" w:cs="Segoe UI" w:eastAsia="Segoe UI" w:hAnsi="Segoe UI"/>
           <w:i/>
           <w:iCs/>
           <w:color w:val="475569"/>
           <w:sz w:val="18"/>
           <w:szCs w:val="18"/>
         </w:rPr>
-        <w:t xml:space="preserve">Keep it energetic and confident. Finish within 25–30 seconds. Hand over seamlessly to Speaker 2: 'To explain the core problem and our unified solution, I hand over to [Speaker 2 Name].'</w:t>
+        <w:t>Keep it energetic and confident. Finish within 25–30 seconds. Hand over seamlessly to Speaker 2: 'To explain the core problem and our unified solution, I hand over to [Speaker 2 Name].'</w:t>
       </w:r>
     </w:p>
     <w:p>
       <w:pPr>
         <w:pStyle w:val="Heading1"/>
-        <w:spacing w:after="150" w:before="300"/>
-      </w:pPr>
-      <w:r>
-        <w:rPr>
-          <w:rFonts w:ascii="Segoe UI" w:cs="Segoe UI" w:eastAsia="Segoe UI" w:hAnsi="Segoe UI"/>
+        <w:spacing w:before="300" w:after="150"/>
+      </w:pPr>
+      <w:r>
+        <w:rPr>
           <w:b/>
           <w:bCs/>
           <w:color w:val="134E4A"/>
           <w:sz w:val="26"/>
           <w:szCs w:val="26"/>
         </w:rPr>
-        <w:t xml:space="preserve">SLIDE 2: IDEA TITLE &amp; PROPOSED SOLUTION</w:t>
+        <w:t>SLIDE 2: IDEA TITLE &amp; PROPOSED SOLUTION</w:t>
       </w:r>
     </w:p>
     <w:tbl>
       <w:tblPr>
-        <w:tblW w:type="pct" w:w="100%"/>
+        <w:tblW w:w="5000" w:type="pct"/>
         <w:tblBorders>
-          <w:top w:val="none" w:color="auto" w:sz="0"/>
-          <w:left w:val="single" w:color="0F766E" w:sz="12"/>
-          <w:bottom w:val="single" w:color="0F766E" w:sz="4"/>
-          <w:right w:val="none" w:color="auto" w:sz="0"/>
-          <w:insideH w:val="single" w:color="auto" w:sz="4"/>
-          <w:insideV w:val="single" w:color="auto" w:sz="4"/>
+          <w:left w:val="single" w:sz="12" w:space="0" w:color="0F766E"/>
+          <w:bottom w:val="single" w:sz="4" w:space="0" w:color="0F766E"/>
+          <w:insideH w:val="single" w:sz="4" w:space="0" w:color="auto"/>
+          <w:insideV w:val="single" w:sz="4" w:space="0" w:color="auto"/>
         </w:tblBorders>
+        <w:tblCellMar>
+          <w:left w:w="10" w:type="dxa"/>
+          <w:right w:w="10" w:type="dxa"/>
+        </w:tblCellMar>
+        <w:tblLook w:val="0000" w:firstRow="0" w:lastRow="0" w:firstColumn="0" w:lastColumn="0" w:noHBand="0" w:noVBand="0"/>
       </w:tblPr>
       <w:tblGrid>
-        <w:gridCol w:w="100"/>
+        <w:gridCol w:w="9891"/>
       </w:tblGrid>
       <w:tr>
+        <w:tblPrEx>
+          <w:tblCellMar>
+            <w:top w:w="0" w:type="dxa"/>
+            <w:bottom w:w="0" w:type="dxa"/>
+          </w:tblCellMar>
+        </w:tblPrEx>
         <w:tc>
           <w:tcPr>
-            <w:tcW w:type="pct" w:w="100%"/>
-            <w:shd w:fill="F0FDFA" w:val="clear"/>
+            <w:tcW w:w="5000" w:type="pct"/>
+            <w:shd w:val="clear" w:color="auto" w:fill="F0FDFA"/>
           </w:tcPr>
           <w:p>
             <w:r>
               <w:rPr>
-                <w:rFonts w:ascii="Segoe UI" w:cs="Segoe UI" w:eastAsia="Segoe UI" w:hAnsi="Segoe UI"/>
                 <w:b/>
                 <w:bCs/>
                 <w:color w:val="134E4A"/>
                 <w:sz w:val="22"/>
                 <w:szCs w:val="22"/>
               </w:rPr>
-              <w:t xml:space="preserve">🎤 SPEAKER 2 (Product &amp; Healthcare Solution Lead)</w:t>
+              <w:t>🎤 SPEAKER 2 (Product &amp; Healthcare Solution Lead)</w:t>
             </w:r>
             <w:r>
               <w:rPr>
-                <w:rFonts w:ascii="Segoe UI" w:cs="Segoe UI" w:eastAsia="Segoe UI" w:hAnsi="Segoe UI"/>
                 <w:b/>
                 <w:bCs/>
                 <w:color w:val="0284C7"/>
@@ -669,17 +679,15 @@
     </w:tbl>
     <w:p>
       <w:pPr>
-        <w:spacing w:after="50" w:before="100"/>
-      </w:pPr>
-      <w:r>
-        <w:rPr>
-          <w:b/>
-          <w:bCs/>
-          <w:color w:val="134E4A"/>
-          <w:sz w:val="20"/>
-          <w:szCs w:val="20"/>
-        </w:rPr>
-        <w:t xml:space="preserve">Spoken Script:</w:t>
+        <w:spacing w:before="100" w:after="50"/>
+      </w:pPr>
+      <w:r>
+        <w:rPr>
+          <w:b/>
+          <w:bCs/>
+          <w:color w:val="134E4A"/>
+        </w:rPr>
+        <w:t>Spoken Script:</w:t>
       </w:r>
     </w:p>
     <w:p>
@@ -689,11 +697,10 @@
           <w:ilvl w:val="0"/>
           <w:numId w:val="1"/>
         </w:numPr>
-        <w:spacing w:after="120" w:line="276"/>
-      </w:pPr>
-      <w:r>
-        <w:rPr>
-          <w:rFonts w:ascii="Segoe UI" w:cs="Segoe UI" w:eastAsia="Segoe UI" w:hAnsi="Segoe UI"/>
+        <w:spacing w:after="120" w:line="276" w:lineRule="auto"/>
+      </w:pPr>
+      <w:r>
+        <w:rPr>
           <w:b/>
           <w:bCs/>
           <w:color w:val="134E4A"/>
@@ -704,12 +711,10 @@
       </w:r>
       <w:r>
         <w:rPr>
-          <w:rFonts w:ascii="Segoe UI" w:cs="Segoe UI" w:eastAsia="Segoe UI" w:hAnsi="Segoe UI"/>
-          <w:color w:val="0F172A"/>
-          <w:sz w:val="21"/>
-          <w:szCs w:val="21"/>
-        </w:rPr>
-        <w:t xml:space="preserve">“The fundamental challenge we are solving is the massive coordination breakdown in rural healthcare. Rural patients travel 50 to 100 kilometers blindly to district hospitals, only to find specialist doctors absent, emergency beds full, or essential medicines out of stock.”</w:t>
+          <w:sz w:val="21"/>
+          <w:szCs w:val="21"/>
+        </w:rPr>
+        <w:t>“The fundamental challenge we are solving is the massive coordination breakdown in rural healthcare. Rural patients travel 50 to 100 kilometers blindly to district hospitals, only to find specialist doctors absent, emergency beds full, or essential medicines out of stock.”</w:t>
       </w:r>
     </w:p>
     <w:p>
@@ -719,11 +724,10 @@
           <w:ilvl w:val="0"/>
           <w:numId w:val="1"/>
         </w:numPr>
-        <w:spacing w:after="120" w:line="276"/>
-      </w:pPr>
-      <w:r>
-        <w:rPr>
-          <w:rFonts w:ascii="Segoe UI" w:cs="Segoe UI" w:eastAsia="Segoe UI" w:hAnsi="Segoe UI"/>
+        <w:spacing w:after="120" w:line="276" w:lineRule="auto"/>
+      </w:pPr>
+      <w:r>
+        <w:rPr>
           <w:b/>
           <w:bCs/>
           <w:color w:val="134E4A"/>
@@ -734,12 +738,10 @@
       </w:r>
       <w:r>
         <w:rPr>
-          <w:rFonts w:ascii="Segoe UI" w:cs="Segoe UI" w:eastAsia="Segoe UI" w:hAnsi="Segoe UI"/>
-          <w:color w:val="0F172A"/>
-          <w:sz w:val="21"/>
-          <w:szCs w:val="21"/>
-        </w:rPr>
-        <w:t xml:space="preserve">“Our solution, JeevanSetu (HealthcareBridge), is a unified digital coordination layer that connects rural citizens, Primary Health Centres (PHCs), and district referral networks through four core pillars:”</w:t>
+          <w:sz w:val="21"/>
+          <w:szCs w:val="21"/>
+        </w:rPr>
+        <w:t>“Our solution, JeevanSetu (HealthcareBridge), is a unified digital coordination layer that connects rural citizens, Primary Health Centres (PHCs), and district referral networks through four core pillars:”</w:t>
       </w:r>
     </w:p>
     <w:p>
@@ -749,27 +751,25 @@
           <w:ilvl w:val="0"/>
           <w:numId w:val="1"/>
         </w:numPr>
-        <w:spacing w:after="120" w:line="276"/>
-      </w:pPr>
-      <w:r>
-        <w:rPr>
-          <w:rFonts w:ascii="Segoe UI" w:cs="Segoe UI" w:eastAsia="Segoe UI" w:hAnsi="Segoe UI"/>
-          <w:b/>
-          <w:bCs/>
-          <w:color w:val="134E4A"/>
-          <w:sz w:val="21"/>
-          <w:szCs w:val="21"/>
-        </w:rPr>
+        <w:spacing w:after="120" w:line="276" w:lineRule="auto"/>
+      </w:pPr>
+      <w:r>
+        <w:rPr>
+          <w:b/>
+          <w:bCs/>
+          <w:color w:val="134E4A"/>
+          <w:sz w:val="21"/>
+          <w:szCs w:val="21"/>
+        </w:rPr>
+        <w:lastRenderedPageBreak/>
         <w:t xml:space="preserve">How It Works: </w:t>
       </w:r>
       <w:r>
         <w:rPr>
-          <w:rFonts w:ascii="Segoe UI" w:cs="Segoe UI" w:eastAsia="Segoe UI" w:hAnsi="Segoe UI"/>
-          <w:color w:val="0F172A"/>
-          <w:sz w:val="21"/>
-          <w:szCs w:val="21"/>
-        </w:rPr>
-        <w:t xml:space="preserve">“First, 'Check Before You Travel' — giving patients real-time readiness status before they leave home. Second, 5-Stage Multi-Tier Referral Tracking so no patient's case drops silently. Third, Predictive Medicine Inventory Warnings connected to Maharashtra DVDMS to prevent sudden stockouts. And fourth, a Conversational Voice AI Assistant in Marathi, Hindi, and English.”</w:t>
+          <w:sz w:val="21"/>
+          <w:szCs w:val="21"/>
+        </w:rPr>
+        <w:t>“First, 'Check Before You Travel' — giving patients real-time readiness status before they leave home. Second, 5-Stage Multi-Tier Referral Tracking so no patient's case drops silently. Third, Predictive Medicine Inventory Warnings connected to Maharashtra DVDMS to prevent sudden stockouts. And fourth, a Conversational Voice AI Assistant in Marathi, Hindi, and English.”</w:t>
       </w:r>
     </w:p>
     <w:p>
@@ -779,11 +779,10 @@
           <w:ilvl w:val="0"/>
           <w:numId w:val="1"/>
         </w:numPr>
-        <w:spacing w:after="120" w:line="276"/>
-      </w:pPr>
-      <w:r>
-        <w:rPr>
-          <w:rFonts w:ascii="Segoe UI" w:cs="Segoe UI" w:eastAsia="Segoe UI" w:hAnsi="Segoe UI"/>
+        <w:spacing w:after="120" w:line="276" w:lineRule="auto"/>
+      </w:pPr>
+      <w:r>
+        <w:rPr>
           <w:b/>
           <w:bCs/>
           <w:color w:val="134E4A"/>
@@ -794,21 +793,18 @@
       </w:r>
       <w:r>
         <w:rPr>
-          <w:rFonts w:ascii="Segoe UI" w:cs="Segoe UI" w:eastAsia="Segoe UI" w:hAnsi="Segoe UI"/>
-          <w:color w:val="0F172A"/>
-          <w:sz w:val="21"/>
-          <w:szCs w:val="21"/>
-        </w:rPr>
-        <w:t xml:space="preserve">“What makes JeevanSetu truly unique is that it is strictly non-diagnostic and 100% grounded in verified government data, PM-JAY, and MJPJAY schemes — ensuring zero AI hallucinations and complete clinical safety.”</w:t>
-      </w:r>
-    </w:p>
-    <w:p>
-      <w:pPr>
-        <w:spacing w:after="200" w:before="100"/>
-      </w:pPr>
-      <w:r>
-        <w:rPr>
-          <w:rFonts w:ascii="Segoe UI" w:cs="Segoe UI" w:eastAsia="Segoe UI" w:hAnsi="Segoe UI"/>
+          <w:sz w:val="21"/>
+          <w:szCs w:val="21"/>
+        </w:rPr>
+        <w:t>“What makes JeevanSetu truly unique is that it is strictly non-diagnostic and 100% grounded in verified government data, PM-JAY, and MJPJAY schemes — ensuring zero AI hallucinations and complete clinical safety.”</w:t>
+      </w:r>
+    </w:p>
+    <w:p>
+      <w:pPr>
+        <w:spacing w:before="100" w:after="200"/>
+      </w:pPr>
+      <w:r>
+        <w:rPr>
           <w:b/>
           <w:bCs/>
           <w:color w:val="0284C7"/>
@@ -819,69 +815,74 @@
       </w:r>
       <w:r>
         <w:rPr>
-          <w:rFonts w:ascii="Segoe UI" w:cs="Segoe UI" w:eastAsia="Segoe UI" w:hAnsi="Segoe UI"/>
           <w:i/>
           <w:iCs/>
           <w:color w:val="475569"/>
           <w:sz w:val="18"/>
           <w:szCs w:val="18"/>
         </w:rPr>
-        <w:t xml:space="preserve">Point to the live prototype screenshot on the slide. Hand over to Speaker 3: 'Now, [Speaker 3 Name] will walk you through our robust technical architecture.'</w:t>
+        <w:t>Point to the live prototype screenshot on the slide. Hand over to Speaker 3: 'Now, [Speaker 3 Name] will walk you through our robust technical architecture.'</w:t>
       </w:r>
     </w:p>
     <w:p>
       <w:pPr>
         <w:pStyle w:val="Heading1"/>
-        <w:spacing w:after="150" w:before="300"/>
-      </w:pPr>
-      <w:r>
-        <w:rPr>
-          <w:rFonts w:ascii="Segoe UI" w:cs="Segoe UI" w:eastAsia="Segoe UI" w:hAnsi="Segoe UI"/>
+        <w:spacing w:before="300" w:after="150"/>
+      </w:pPr>
+      <w:r>
+        <w:rPr>
           <w:b/>
           <w:bCs/>
           <w:color w:val="134E4A"/>
           <w:sz w:val="26"/>
           <w:szCs w:val="26"/>
         </w:rPr>
-        <w:t xml:space="preserve">SLIDE 3: TECHNICAL APPROACH &amp; ARCHITECTURE</w:t>
+        <w:t>SLIDE 3: TECHNICAL APPROACH &amp; ARCHITECTURE</w:t>
       </w:r>
     </w:p>
     <w:tbl>
       <w:tblPr>
-        <w:tblW w:type="pct" w:w="100%"/>
+        <w:tblW w:w="5000" w:type="pct"/>
         <w:tblBorders>
-          <w:top w:val="none" w:color="auto" w:sz="0"/>
-          <w:left w:val="single" w:color="0F766E" w:sz="12"/>
-          <w:bottom w:val="single" w:color="0F766E" w:sz="4"/>
-          <w:right w:val="none" w:color="auto" w:sz="0"/>
-          <w:insideH w:val="single" w:color="auto" w:sz="4"/>
-          <w:insideV w:val="single" w:color="auto" w:sz="4"/>
+          <w:left w:val="single" w:sz="12" w:space="0" w:color="0F766E"/>
+          <w:bottom w:val="single" w:sz="4" w:space="0" w:color="0F766E"/>
+          <w:insideH w:val="single" w:sz="4" w:space="0" w:color="auto"/>
+          <w:insideV w:val="single" w:sz="4" w:space="0" w:color="auto"/>
         </w:tblBorders>
+        <w:tblCellMar>
+          <w:left w:w="10" w:type="dxa"/>
+          <w:right w:w="10" w:type="dxa"/>
+        </w:tblCellMar>
+        <w:tblLook w:val="0000" w:firstRow="0" w:lastRow="0" w:firstColumn="0" w:lastColumn="0" w:noHBand="0" w:noVBand="0"/>
       </w:tblPr>
       <w:tblGrid>
-        <w:gridCol w:w="100"/>
+        <w:gridCol w:w="9891"/>
       </w:tblGrid>
       <w:tr>
+        <w:tblPrEx>
+          <w:tblCellMar>
+            <w:top w:w="0" w:type="dxa"/>
+            <w:bottom w:w="0" w:type="dxa"/>
+          </w:tblCellMar>
+        </w:tblPrEx>
         <w:tc>
           <w:tcPr>
-            <w:tcW w:type="pct" w:w="100%"/>
-            <w:shd w:fill="F0FDFA" w:val="clear"/>
+            <w:tcW w:w="5000" w:type="pct"/>
+            <w:shd w:val="clear" w:color="auto" w:fill="F0FDFA"/>
           </w:tcPr>
           <w:p>
             <w:r>
               <w:rPr>
-                <w:rFonts w:ascii="Segoe UI" w:cs="Segoe UI" w:eastAsia="Segoe UI" w:hAnsi="Segoe UI"/>
                 <w:b/>
                 <w:bCs/>
                 <w:color w:val="134E4A"/>
                 <w:sz w:val="22"/>
                 <w:szCs w:val="22"/>
               </w:rPr>
-              <w:t xml:space="preserve">🎤 SPEAKER 3 (System Architect &amp; Tech Lead)</w:t>
+              <w:t>🎤 SPEAKER 3 (System Architect &amp; Tech Lead)</w:t>
             </w:r>
             <w:r>
               <w:rPr>
-                <w:rFonts w:ascii="Segoe UI" w:cs="Segoe UI" w:eastAsia="Segoe UI" w:hAnsi="Segoe UI"/>
                 <w:b/>
                 <w:bCs/>
                 <w:color w:val="0284C7"/>
@@ -896,17 +897,15 @@
     </w:tbl>
     <w:p>
       <w:pPr>
-        <w:spacing w:after="50" w:before="100"/>
-      </w:pPr>
-      <w:r>
-        <w:rPr>
-          <w:b/>
-          <w:bCs/>
-          <w:color w:val="134E4A"/>
-          <w:sz w:val="20"/>
-          <w:szCs w:val="20"/>
-        </w:rPr>
-        <w:t xml:space="preserve">Spoken Script:</w:t>
+        <w:spacing w:before="100" w:after="50"/>
+      </w:pPr>
+      <w:r>
+        <w:rPr>
+          <w:b/>
+          <w:bCs/>
+          <w:color w:val="134E4A"/>
+        </w:rPr>
+        <w:t>Spoken Script:</w:t>
       </w:r>
     </w:p>
     <w:p>
@@ -916,11 +915,10 @@
           <w:ilvl w:val="0"/>
           <w:numId w:val="1"/>
         </w:numPr>
-        <w:spacing w:after="120" w:line="276"/>
-      </w:pPr>
-      <w:r>
-        <w:rPr>
-          <w:rFonts w:ascii="Segoe UI" w:cs="Segoe UI" w:eastAsia="Segoe UI" w:hAnsi="Segoe UI"/>
+        <w:spacing w:after="120" w:line="276" w:lineRule="auto"/>
+      </w:pPr>
+      <w:r>
+        <w:rPr>
           <w:b/>
           <w:bCs/>
           <w:color w:val="134E4A"/>
@@ -931,12 +929,10 @@
       </w:r>
       <w:r>
         <w:rPr>
-          <w:rFonts w:ascii="Segoe UI" w:cs="Segoe UI" w:eastAsia="Segoe UI" w:hAnsi="Segoe UI"/>
-          <w:color w:val="0F172A"/>
-          <w:sz w:val="21"/>
-          <w:szCs w:val="21"/>
-        </w:rPr>
-        <w:t xml:space="preserve">“JeevanSetu is built on a high-performance modern tech stack: Next.js with Turbopack, TailwindCSS for accessible UI, Node.js API Gateway, Supabase PostgreSQL with Row-Level Security, and a native Web Speech API layer supporting Marathi, Hindi, and English.”</w:t>
+          <w:sz w:val="21"/>
+          <w:szCs w:val="21"/>
+        </w:rPr>
+        <w:t>“JeevanSetu is built on a high-performance modern tech stack: Next.js with Turbopack, TailwindCSS for accessible UI, Node.js API Gateway, Supabase PostgreSQL with Row-Level Security, and a native Web Speech API layer supporting Marathi, Hindi, and English.”</w:t>
       </w:r>
     </w:p>
     <w:p>
@@ -946,11 +942,10 @@
           <w:ilvl w:val="0"/>
           <w:numId w:val="1"/>
         </w:numPr>
-        <w:spacing w:after="120" w:line="276"/>
-      </w:pPr>
-      <w:r>
-        <w:rPr>
-          <w:rFonts w:ascii="Segoe UI" w:cs="Segoe UI" w:eastAsia="Segoe UI" w:hAnsi="Segoe UI"/>
+        <w:spacing w:after="120" w:line="276" w:lineRule="auto"/>
+      </w:pPr>
+      <w:r>
+        <w:rPr>
           <w:b/>
           <w:bCs/>
           <w:color w:val="134E4A"/>
@@ -961,12 +956,10 @@
       </w:r>
       <w:r>
         <w:rPr>
-          <w:rFonts w:ascii="Segoe UI" w:cs="Segoe UI" w:eastAsia="Segoe UI" w:hAnsi="Segoe UI"/>
-          <w:color w:val="0F172A"/>
-          <w:sz w:val="21"/>
-          <w:szCs w:val="21"/>
-        </w:rPr>
-        <w:t xml:space="preserve">“Our workflow is linear and fail-safe: Input → Processing → Output. The citizen speaks or types their healthcare need in Marathi. The processing engine matches verified government registries, calculates referral routing, and verifies scheme eligibility through deterministic safety guardrails. The output delivers instant facility readiness, tracked digital referral tokens, and 108 emergency escalation when needed.”</w:t>
+          <w:sz w:val="21"/>
+          <w:szCs w:val="21"/>
+        </w:rPr>
+        <w:t>“Our workflow is linear and fail-safe: Input → Processing → Output. The citizen speaks or types their healthcare need in Marathi. The processing engine matches verified government registries, calculates referral routing, and verifies scheme eligibility through deterministic safety guardrails. The output delivers instant facility readiness, tracked digital referral tokens, and 108 emergency escalation when needed.”</w:t>
       </w:r>
     </w:p>
     <w:p>
@@ -976,11 +969,10 @@
           <w:ilvl w:val="0"/>
           <w:numId w:val="1"/>
         </w:numPr>
-        <w:spacing w:after="120" w:line="276"/>
-      </w:pPr>
-      <w:r>
-        <w:rPr>
-          <w:rFonts w:ascii="Segoe UI" w:cs="Segoe UI" w:eastAsia="Segoe UI" w:hAnsi="Segoe UI"/>
+        <w:spacing w:after="120" w:line="276" w:lineRule="auto"/>
+      </w:pPr>
+      <w:r>
+        <w:rPr>
           <w:b/>
           <w:bCs/>
           <w:color w:val="134E4A"/>
@@ -991,21 +983,18 @@
       </w:r>
       <w:r>
         <w:rPr>
-          <w:rFonts w:ascii="Segoe UI" w:cs="Segoe UI" w:eastAsia="Segoe UI" w:hAnsi="Segoe UI"/>
-          <w:color w:val="0F172A"/>
-          <w:sz w:val="21"/>
-          <w:szCs w:val="21"/>
-        </w:rPr>
-        <w:t xml:space="preserve">“We have built a fully functional, production-ready live prototype with real pre-loaded datasets covering all 36 districts of Maharashtra, interactive live voice AI, and live inventory auditing across 20+ Essential Drugs.”</w:t>
-      </w:r>
-    </w:p>
-    <w:p>
-      <w:pPr>
-        <w:spacing w:after="200" w:before="100"/>
-      </w:pPr>
-      <w:r>
-        <w:rPr>
-          <w:rFonts w:ascii="Segoe UI" w:cs="Segoe UI" w:eastAsia="Segoe UI" w:hAnsi="Segoe UI"/>
+          <w:sz w:val="21"/>
+          <w:szCs w:val="21"/>
+        </w:rPr>
+        <w:t>“We have built a fully functional, production-ready live prototype with real pre-loaded datasets covering all 36 districts of Maharashtra, interactive live voice AI, and live inventory auditing across 20+ Essential Drugs.”</w:t>
+      </w:r>
+    </w:p>
+    <w:p>
+      <w:pPr>
+        <w:spacing w:before="100" w:after="200"/>
+      </w:pPr>
+      <w:r>
+        <w:rPr>
           <w:b/>
           <w:bCs/>
           <w:color w:val="0284C7"/>
@@ -1016,69 +1005,74 @@
       </w:r>
       <w:r>
         <w:rPr>
-          <w:rFonts w:ascii="Segoe UI" w:cs="Segoe UI" w:eastAsia="Segoe UI" w:hAnsi="Segoe UI"/>
           <w:i/>
           <w:iCs/>
           <w:color w:val="475569"/>
           <w:sz w:val="18"/>
           <w:szCs w:val="18"/>
         </w:rPr>
-        <w:t xml:space="preserve">Mention that the code is live and running at localhost / production URL. Hand over to Speaker 4: 'To discuss real-world feasibility and risk mitigations, here is [Speaker 4 Name].'</w:t>
+        <w:t>Mention that the code is live and running at localhost / production URL. Hand over to Speaker 4: 'To discuss real-world feasibility and risk mitigations, here is [Speaker 4 Name].'</w:t>
       </w:r>
     </w:p>
     <w:p>
       <w:pPr>
         <w:pStyle w:val="Heading1"/>
-        <w:spacing w:after="150" w:before="300"/>
-      </w:pPr>
-      <w:r>
-        <w:rPr>
-          <w:rFonts w:ascii="Segoe UI" w:cs="Segoe UI" w:eastAsia="Segoe UI" w:hAnsi="Segoe UI"/>
+        <w:spacing w:before="300" w:after="150"/>
+      </w:pPr>
+      <w:r>
+        <w:rPr>
           <w:b/>
           <w:bCs/>
           <w:color w:val="134E4A"/>
           <w:sz w:val="26"/>
           <w:szCs w:val="26"/>
         </w:rPr>
-        <w:t xml:space="preserve">SLIDE 4: FEASIBILITY &amp; VIABILITY</w:t>
+        <w:t>SLIDE 4: FEASIBILITY &amp; VIABILITY</w:t>
       </w:r>
     </w:p>
     <w:tbl>
       <w:tblPr>
-        <w:tblW w:type="pct" w:w="100%"/>
+        <w:tblW w:w="5000" w:type="pct"/>
         <w:tblBorders>
-          <w:top w:val="none" w:color="auto" w:sz="0"/>
-          <w:left w:val="single" w:color="0F766E" w:sz="12"/>
-          <w:bottom w:val="single" w:color="0F766E" w:sz="4"/>
-          <w:right w:val="none" w:color="auto" w:sz="0"/>
-          <w:insideH w:val="single" w:color="auto" w:sz="4"/>
-          <w:insideV w:val="single" w:color="auto" w:sz="4"/>
+          <w:left w:val="single" w:sz="12" w:space="0" w:color="0F766E"/>
+          <w:bottom w:val="single" w:sz="4" w:space="0" w:color="0F766E"/>
+          <w:insideH w:val="single" w:sz="4" w:space="0" w:color="auto"/>
+          <w:insideV w:val="single" w:sz="4" w:space="0" w:color="auto"/>
         </w:tblBorders>
+        <w:tblCellMar>
+          <w:left w:w="10" w:type="dxa"/>
+          <w:right w:w="10" w:type="dxa"/>
+        </w:tblCellMar>
+        <w:tblLook w:val="0000" w:firstRow="0" w:lastRow="0" w:firstColumn="0" w:lastColumn="0" w:noHBand="0" w:noVBand="0"/>
       </w:tblPr>
       <w:tblGrid>
-        <w:gridCol w:w="100"/>
+        <w:gridCol w:w="9891"/>
       </w:tblGrid>
       <w:tr>
+        <w:tblPrEx>
+          <w:tblCellMar>
+            <w:top w:w="0" w:type="dxa"/>
+            <w:bottom w:w="0" w:type="dxa"/>
+          </w:tblCellMar>
+        </w:tblPrEx>
         <w:tc>
           <w:tcPr>
-            <w:tcW w:type="pct" w:w="100%"/>
-            <w:shd w:fill="F0FDFA" w:val="clear"/>
+            <w:tcW w:w="5000" w:type="pct"/>
+            <w:shd w:val="clear" w:color="auto" w:fill="F0FDFA"/>
           </w:tcPr>
           <w:p>
             <w:r>
               <w:rPr>
-                <w:rFonts w:ascii="Segoe UI" w:cs="Segoe UI" w:eastAsia="Segoe UI" w:hAnsi="Segoe UI"/>
                 <w:b/>
                 <w:bCs/>
                 <w:color w:val="134E4A"/>
                 <w:sz w:val="22"/>
                 <w:szCs w:val="22"/>
               </w:rPr>
-              <w:t xml:space="preserve">🎤 SPEAKER 4 (Operations &amp; Deployment Lead)</w:t>
+              <w:t>🎤 SPEAKER 4 (Operations &amp; Deployment Lead)</w:t>
             </w:r>
             <w:r>
               <w:rPr>
-                <w:rFonts w:ascii="Segoe UI" w:cs="Segoe UI" w:eastAsia="Segoe UI" w:hAnsi="Segoe UI"/>
                 <w:b/>
                 <w:bCs/>
                 <w:color w:val="0284C7"/>
@@ -1093,17 +1087,15 @@
     </w:tbl>
     <w:p>
       <w:pPr>
-        <w:spacing w:after="50" w:before="100"/>
-      </w:pPr>
-      <w:r>
-        <w:rPr>
-          <w:b/>
-          <w:bCs/>
-          <w:color w:val="134E4A"/>
-          <w:sz w:val="20"/>
-          <w:szCs w:val="20"/>
-        </w:rPr>
-        <w:t xml:space="preserve">Spoken Script:</w:t>
+        <w:spacing w:before="100" w:after="50"/>
+      </w:pPr>
+      <w:r>
+        <w:rPr>
+          <w:b/>
+          <w:bCs/>
+          <w:color w:val="134E4A"/>
+        </w:rPr>
+        <w:t>Spoken Script:</w:t>
       </w:r>
     </w:p>
     <w:p>
@@ -1113,11 +1105,10 @@
           <w:ilvl w:val="0"/>
           <w:numId w:val="1"/>
         </w:numPr>
-        <w:spacing w:after="120" w:line="276"/>
-      </w:pPr>
-      <w:r>
-        <w:rPr>
-          <w:rFonts w:ascii="Segoe UI" w:cs="Segoe UI" w:eastAsia="Segoe UI" w:hAnsi="Segoe UI"/>
+        <w:spacing w:after="120" w:line="276" w:lineRule="auto"/>
+      </w:pPr>
+      <w:r>
+        <w:rPr>
           <w:b/>
           <w:bCs/>
           <w:color w:val="134E4A"/>
@@ -1128,12 +1119,10 @@
       </w:r>
       <w:r>
         <w:rPr>
-          <w:rFonts w:ascii="Segoe UI" w:cs="Segoe UI" w:eastAsia="Segoe UI" w:hAnsi="Segoe UI"/>
-          <w:color w:val="0F172A"/>
-          <w:sz w:val="21"/>
-          <w:szCs w:val="21"/>
-        </w:rPr>
-        <w:t xml:space="preserve">“JeevanSetu is highly feasible because it is completely web-first with zero proprietary hardware requirements. It deploys immediately on existing PHC desktops, ASHA tablets, and low-cost smartphones.”</w:t>
+          <w:sz w:val="21"/>
+          <w:szCs w:val="21"/>
+        </w:rPr>
+        <w:t>“JeevanSetu is highly feasible because it is completely web-first with zero proprietary hardware requirements. It deploys immediately on existing PHC desktops, ASHA tablets, and low-cost smartphones.”</w:t>
       </w:r>
     </w:p>
     <w:p>
@@ -1143,11 +1132,10 @@
           <w:ilvl w:val="0"/>
           <w:numId w:val="1"/>
         </w:numPr>
-        <w:spacing w:after="120" w:line="276"/>
-      </w:pPr>
-      <w:r>
-        <w:rPr>
-          <w:rFonts w:ascii="Segoe UI" w:cs="Segoe UI" w:eastAsia="Segoe UI" w:hAnsi="Segoe UI"/>
+        <w:spacing w:after="120" w:line="276" w:lineRule="auto"/>
+      </w:pPr>
+      <w:r>
+        <w:rPr>
           <w:b/>
           <w:bCs/>
           <w:color w:val="134E4A"/>
@@ -1158,12 +1146,10 @@
       </w:r>
       <w:r>
         <w:rPr>
-          <w:rFonts w:ascii="Segoe UI" w:cs="Segoe UI" w:eastAsia="Segoe UI" w:hAnsi="Segoe UI"/>
-          <w:color w:val="0F172A"/>
-          <w:sz w:val="21"/>
-          <w:szCs w:val="21"/>
-        </w:rPr>
-        <w:t xml:space="preserve">“We proactively addressed 4 critical field risks: For poor rural connectivity, we built lightweight PWA caching and planned IVR telephony. For data accuracy, records sync directly with PHC registers and Maharashtra DVDMS. For AI trust, our engine is strictly non-diagnostic — doctors retain 100% clinical authority. And for low-literacy adoption, our 'talk like a phone call' Marathi voice interface eliminates all digital barriers.”</w:t>
+          <w:sz w:val="21"/>
+          <w:szCs w:val="21"/>
+        </w:rPr>
+        <w:t>“We proactively addressed 4 critical field risks: For poor rural connectivity, we built lightweight PWA caching and planned IVR telephony. For data accuracy, records sync directly with PHC registers and Maharashtra DVDMS. For AI trust, our engine is strictly non-diagnostic — doctors retain 100% clinical authority. And for low-literacy adoption, our 'talk like a phone call' Marathi voice interface eliminates all digital barriers.”</w:t>
       </w:r>
     </w:p>
     <w:p>
@@ -1173,11 +1159,10 @@
           <w:ilvl w:val="0"/>
           <w:numId w:val="1"/>
         </w:numPr>
-        <w:spacing w:after="120" w:line="276"/>
-      </w:pPr>
-      <w:r>
-        <w:rPr>
-          <w:rFonts w:ascii="Segoe UI" w:cs="Segoe UI" w:eastAsia="Segoe UI" w:hAnsi="Segoe UI"/>
+        <w:spacing w:after="120" w:line="276" w:lineRule="auto"/>
+      </w:pPr>
+      <w:r>
+        <w:rPr>
           <w:b/>
           <w:bCs/>
           <w:color w:val="134E4A"/>
@@ -1188,21 +1173,18 @@
       </w:r>
       <w:r>
         <w:rPr>
-          <w:rFonts w:ascii="Segoe UI" w:cs="Segoe UI" w:eastAsia="Segoe UI" w:hAnsi="Segoe UI"/>
-          <w:color w:val="0F172A"/>
-          <w:sz w:val="21"/>
-          <w:szCs w:val="21"/>
-        </w:rPr>
-        <w:t xml:space="preserve">“Our 5-stage referral lifecycle — Requested, Reviewed, Accepted, In-Transit, and Completed — creates complete end-to-end accountability across district health networks.”</w:t>
-      </w:r>
-    </w:p>
-    <w:p>
-      <w:pPr>
-        <w:spacing w:after="200" w:before="100"/>
-      </w:pPr>
-      <w:r>
-        <w:rPr>
-          <w:rFonts w:ascii="Segoe UI" w:cs="Segoe UI" w:eastAsia="Segoe UI" w:hAnsi="Segoe UI"/>
+          <w:sz w:val="21"/>
+          <w:szCs w:val="21"/>
+        </w:rPr>
+        <w:t>“Our 5-stage referral lifecycle — Requested, Reviewed, Accepted, In-Transit, and Completed — creates complete end-to-end accountability across district health networks.”</w:t>
+      </w:r>
+    </w:p>
+    <w:p>
+      <w:pPr>
+        <w:spacing w:before="100" w:after="200"/>
+      </w:pPr>
+      <w:r>
+        <w:rPr>
           <w:b/>
           <w:bCs/>
           <w:color w:val="0284C7"/>
@@ -1213,69 +1195,75 @@
       </w:r>
       <w:r>
         <w:rPr>
-          <w:rFonts w:ascii="Segoe UI" w:cs="Segoe UI" w:eastAsia="Segoe UI" w:hAnsi="Segoe UI"/>
           <w:i/>
           <w:iCs/>
           <w:color w:val="475569"/>
           <w:sz w:val="18"/>
           <w:szCs w:val="18"/>
         </w:rPr>
-        <w:t xml:space="preserve">Emphasize the practical nature of the solution. Hand over to Speaker 5: 'To present the measurable ground impact and benefits, here is [Speaker 5 Name].'</w:t>
+        <w:t>Emphasize the practical nature of the solution. Hand over to Speaker 5: 'To present the measurable ground impact and benefits, here is [Speaker 5 Name].'</w:t>
       </w:r>
     </w:p>
     <w:p>
       <w:pPr>
         <w:pStyle w:val="Heading1"/>
-        <w:spacing w:after="150" w:before="300"/>
-      </w:pPr>
-      <w:r>
-        <w:rPr>
-          <w:rFonts w:ascii="Segoe UI" w:cs="Segoe UI" w:eastAsia="Segoe UI" w:hAnsi="Segoe UI"/>
+        <w:spacing w:before="300" w:after="150"/>
+      </w:pPr>
+      <w:r>
+        <w:rPr>
           <w:b/>
           <w:bCs/>
           <w:color w:val="134E4A"/>
           <w:sz w:val="26"/>
           <w:szCs w:val="26"/>
         </w:rPr>
-        <w:t xml:space="preserve">SLIDE 5: IMPACT &amp; BENEFITS</w:t>
+        <w:lastRenderedPageBreak/>
+        <w:t>SLIDE 5: IMPACT &amp; BENEFITS</w:t>
       </w:r>
     </w:p>
     <w:tbl>
       <w:tblPr>
-        <w:tblW w:type="pct" w:w="100%"/>
+        <w:tblW w:w="5000" w:type="pct"/>
         <w:tblBorders>
-          <w:top w:val="none" w:color="auto" w:sz="0"/>
-          <w:left w:val="single" w:color="0F766E" w:sz="12"/>
-          <w:bottom w:val="single" w:color="0F766E" w:sz="4"/>
-          <w:right w:val="none" w:color="auto" w:sz="0"/>
-          <w:insideH w:val="single" w:color="auto" w:sz="4"/>
-          <w:insideV w:val="single" w:color="auto" w:sz="4"/>
+          <w:left w:val="single" w:sz="12" w:space="0" w:color="0F766E"/>
+          <w:bottom w:val="single" w:sz="4" w:space="0" w:color="0F766E"/>
+          <w:insideH w:val="single" w:sz="4" w:space="0" w:color="auto"/>
+          <w:insideV w:val="single" w:sz="4" w:space="0" w:color="auto"/>
         </w:tblBorders>
+        <w:tblCellMar>
+          <w:left w:w="10" w:type="dxa"/>
+          <w:right w:w="10" w:type="dxa"/>
+        </w:tblCellMar>
+        <w:tblLook w:val="0000" w:firstRow="0" w:lastRow="0" w:firstColumn="0" w:lastColumn="0" w:noHBand="0" w:noVBand="0"/>
       </w:tblPr>
       <w:tblGrid>
-        <w:gridCol w:w="100"/>
+        <w:gridCol w:w="9891"/>
       </w:tblGrid>
       <w:tr>
+        <w:tblPrEx>
+          <w:tblCellMar>
+            <w:top w:w="0" w:type="dxa"/>
+            <w:bottom w:w="0" w:type="dxa"/>
+          </w:tblCellMar>
+        </w:tblPrEx>
         <w:tc>
           <w:tcPr>
-            <w:tcW w:type="pct" w:w="100%"/>
-            <w:shd w:fill="F0FDFA" w:val="clear"/>
+            <w:tcW w:w="5000" w:type="pct"/>
+            <w:shd w:val="clear" w:color="auto" w:fill="F0FDFA"/>
           </w:tcPr>
           <w:p>
             <w:r>
               <w:rPr>
-                <w:rFonts w:ascii="Segoe UI" w:cs="Segoe UI" w:eastAsia="Segoe UI" w:hAnsi="Segoe UI"/>
                 <w:b/>
                 <w:bCs/>
                 <w:color w:val="134E4A"/>
                 <w:sz w:val="22"/>
                 <w:szCs w:val="22"/>
               </w:rPr>
-              <w:t xml:space="preserve">🎤 SPEAKER 5 (Impact &amp; Public Health Lead)</w:t>
+              <w:t>🎤 SPEAKER 5 (Impact &amp; Public Health Lead)</w:t>
             </w:r>
             <w:r>
               <w:rPr>
-                <w:rFonts w:ascii="Segoe UI" w:cs="Segoe UI" w:eastAsia="Segoe UI" w:hAnsi="Segoe UI"/>
                 <w:b/>
                 <w:bCs/>
                 <w:color w:val="0284C7"/>
@@ -1290,17 +1278,15 @@
     </w:tbl>
     <w:p>
       <w:pPr>
-        <w:spacing w:after="50" w:before="100"/>
-      </w:pPr>
-      <w:r>
-        <w:rPr>
-          <w:b/>
-          <w:bCs/>
-          <w:color w:val="134E4A"/>
-          <w:sz w:val="20"/>
-          <w:szCs w:val="20"/>
-        </w:rPr>
-        <w:t xml:space="preserve">Spoken Script:</w:t>
+        <w:spacing w:before="100" w:after="50"/>
+      </w:pPr>
+      <w:r>
+        <w:rPr>
+          <w:b/>
+          <w:bCs/>
+          <w:color w:val="134E4A"/>
+        </w:rPr>
+        <w:t>Spoken Script:</w:t>
       </w:r>
     </w:p>
     <w:p>
@@ -1310,11 +1296,10 @@
           <w:ilvl w:val="0"/>
           <w:numId w:val="1"/>
         </w:numPr>
-        <w:spacing w:after="120" w:line="276"/>
-      </w:pPr>
-      <w:r>
-        <w:rPr>
-          <w:rFonts w:ascii="Segoe UI" w:cs="Segoe UI" w:eastAsia="Segoe UI" w:hAnsi="Segoe UI"/>
+        <w:spacing w:after="120" w:line="276" w:lineRule="auto"/>
+      </w:pPr>
+      <w:r>
+        <w:rPr>
           <w:b/>
           <w:bCs/>
           <w:color w:val="134E4A"/>
@@ -1325,12 +1310,10 @@
       </w:r>
       <w:r>
         <w:rPr>
-          <w:rFonts w:ascii="Segoe UI" w:cs="Segoe UI" w:eastAsia="Segoe UI" w:hAnsi="Segoe UI"/>
-          <w:color w:val="0F172A"/>
-          <w:sz w:val="21"/>
-          <w:szCs w:val="21"/>
-        </w:rPr>
-        <w:t xml:space="preserve">“Our target beneficiaries span the entire public healthcare ecosystem: rural citizens, ASHA workers, PHC Medical Officers, and District Health Administrators.”</w:t>
+          <w:sz w:val="21"/>
+          <w:szCs w:val="21"/>
+        </w:rPr>
+        <w:t>“Our target beneficiaries span the entire public healthcare ecosystem: rural citizens, ASHA workers, PHC Medical Officers, and District Health Administrators.”</w:t>
       </w:r>
     </w:p>
     <w:p>
@@ -1340,11 +1323,10 @@
           <w:ilvl w:val="0"/>
           <w:numId w:val="1"/>
         </w:numPr>
-        <w:spacing w:after="120" w:line="276"/>
-      </w:pPr>
-      <w:r>
-        <w:rPr>
-          <w:rFonts w:ascii="Segoe UI" w:cs="Segoe UI" w:eastAsia="Segoe UI" w:hAnsi="Segoe UI"/>
+        <w:spacing w:after="120" w:line="276" w:lineRule="auto"/>
+      </w:pPr>
+      <w:r>
+        <w:rPr>
           <w:b/>
           <w:bCs/>
           <w:color w:val="134E4A"/>
@@ -1355,12 +1337,10 @@
       </w:r>
       <w:r>
         <w:rPr>
-          <w:rFonts w:ascii="Segoe UI" w:cs="Segoe UI" w:eastAsia="Segoe UI" w:hAnsi="Segoe UI"/>
-          <w:color w:val="0F172A"/>
-          <w:sz w:val="21"/>
-          <w:szCs w:val="21"/>
-        </w:rPr>
-        <w:t xml:space="preserve">“JeevanSetu delivers three-dimensional measurable impact: Socially, it eliminates over 60% of wasted travel trips under our 'Don't Make Me Travel Twice' framework and protects maternal health milestones. Economically, it drastically cuts catastrophic out-of-pocket travel expenses and maximizes PM-JAY cashless claims. Operationally, it prevents emergency drug stockouts 5 days in advance and replaces lost paper slips with permanent digital trails.”</w:t>
+          <w:sz w:val="21"/>
+          <w:szCs w:val="21"/>
+        </w:rPr>
+        <w:t>“JeevanSetu delivers three-dimensional measurable impact: Socially, it eliminates over 60% of wasted travel trips under our 'Don't Make Me Travel Twice' framework and protects maternal health milestones. Economically, it drastically cuts catastrophic out-of-pocket travel expenses and maximizes PM-JAY cashless claims. Operationally, it prevents emergency drug stockouts 5 days in advance and replaces lost paper slips with permanent digital trails.”</w:t>
       </w:r>
     </w:p>
     <w:p>
@@ -1370,11 +1350,10 @@
           <w:ilvl w:val="0"/>
           <w:numId w:val="1"/>
         </w:numPr>
-        <w:spacing w:after="120" w:line="276"/>
-      </w:pPr>
-      <w:r>
-        <w:rPr>
-          <w:rFonts w:ascii="Segoe UI" w:cs="Segoe UI" w:eastAsia="Segoe UI" w:hAnsi="Segoe UI"/>
+        <w:spacing w:after="120" w:line="276" w:lineRule="auto"/>
+      </w:pPr>
+      <w:r>
+        <w:rPr>
           <w:b/>
           <w:bCs/>
           <w:color w:val="134E4A"/>
@@ -1385,21 +1364,18 @@
       </w:r>
       <w:r>
         <w:rPr>
-          <w:rFonts w:ascii="Segoe UI" w:cs="Segoe UI" w:eastAsia="Segoe UI" w:hAnsi="Segoe UI"/>
-          <w:color w:val="0F172A"/>
-          <w:sz w:val="21"/>
-          <w:szCs w:val="21"/>
-        </w:rPr>
-        <w:t xml:space="preserve">“Our rollout strategy starts with high-need pilot clusters like Gadchiroli and Chandrapur, expanding seamlessly across all 36 districts of Maharashtra and nationwide under the National Health Mission.”</w:t>
-      </w:r>
-    </w:p>
-    <w:p>
-      <w:pPr>
-        <w:spacing w:after="200" w:before="100"/>
-      </w:pPr>
-      <w:r>
-        <w:rPr>
-          <w:rFonts w:ascii="Segoe UI" w:cs="Segoe UI" w:eastAsia="Segoe UI" w:hAnsi="Segoe UI"/>
+          <w:sz w:val="21"/>
+          <w:szCs w:val="21"/>
+        </w:rPr>
+        <w:t>“Our rollout strategy starts with high-need pilot clusters like Gadchiroli and Chandrapur, expanding seamlessly across all 36 districts of Maharashtra and nationwide under the National Health Mission.”</w:t>
+      </w:r>
+    </w:p>
+    <w:p>
+      <w:pPr>
+        <w:spacing w:before="100" w:after="200"/>
+      </w:pPr>
+      <w:r>
+        <w:rPr>
           <w:b/>
           <w:bCs/>
           <w:color w:val="0284C7"/>
@@ -1410,69 +1386,74 @@
       </w:r>
       <w:r>
         <w:rPr>
-          <w:rFonts w:ascii="Segoe UI" w:cs="Segoe UI" w:eastAsia="Segoe UI" w:hAnsi="Segoe UI"/>
           <w:i/>
           <w:iCs/>
           <w:color w:val="475569"/>
           <w:sz w:val="18"/>
           <w:szCs w:val="18"/>
         </w:rPr>
-        <w:t xml:space="preserve">Highlight the 'Don't Make Me Travel Twice' slogan. Hand over to Speaker 6: 'Now, [Speaker 6 Name] will explain our research backing and policy grounding.'</w:t>
+        <w:t>Highlight the 'Don't Make Me Travel Twice' slogan. Hand over to Speaker 6: 'Now, [Speaker 6 Name] will explain our research backing and policy grounding.'</w:t>
       </w:r>
     </w:p>
     <w:p>
       <w:pPr>
         <w:pStyle w:val="Heading1"/>
-        <w:spacing w:after="150" w:before="300"/>
-      </w:pPr>
-      <w:r>
-        <w:rPr>
-          <w:rFonts w:ascii="Segoe UI" w:cs="Segoe UI" w:eastAsia="Segoe UI" w:hAnsi="Segoe UI"/>
+        <w:spacing w:before="300" w:after="150"/>
+      </w:pPr>
+      <w:r>
+        <w:rPr>
           <w:b/>
           <w:bCs/>
           <w:color w:val="134E4A"/>
           <w:sz w:val="26"/>
           <w:szCs w:val="26"/>
         </w:rPr>
-        <w:t xml:space="preserve">SLIDE 6: RESEARCH &amp; REFERENCES</w:t>
+        <w:t>SLIDE 6: RESEARCH &amp; REFERENCES</w:t>
       </w:r>
     </w:p>
     <w:tbl>
       <w:tblPr>
-        <w:tblW w:type="pct" w:w="100%"/>
+        <w:tblW w:w="5000" w:type="pct"/>
         <w:tblBorders>
-          <w:top w:val="none" w:color="auto" w:sz="0"/>
-          <w:left w:val="single" w:color="0F766E" w:sz="12"/>
-          <w:bottom w:val="single" w:color="0F766E" w:sz="4"/>
-          <w:right w:val="none" w:color="auto" w:sz="0"/>
-          <w:insideH w:val="single" w:color="auto" w:sz="4"/>
-          <w:insideV w:val="single" w:color="auto" w:sz="4"/>
+          <w:left w:val="single" w:sz="12" w:space="0" w:color="0F766E"/>
+          <w:bottom w:val="single" w:sz="4" w:space="0" w:color="0F766E"/>
+          <w:insideH w:val="single" w:sz="4" w:space="0" w:color="auto"/>
+          <w:insideV w:val="single" w:sz="4" w:space="0" w:color="auto"/>
         </w:tblBorders>
+        <w:tblCellMar>
+          <w:left w:w="10" w:type="dxa"/>
+          <w:right w:w="10" w:type="dxa"/>
+        </w:tblCellMar>
+        <w:tblLook w:val="0000" w:firstRow="0" w:lastRow="0" w:firstColumn="0" w:lastColumn="0" w:noHBand="0" w:noVBand="0"/>
       </w:tblPr>
       <w:tblGrid>
-        <w:gridCol w:w="100"/>
+        <w:gridCol w:w="9891"/>
       </w:tblGrid>
       <w:tr>
+        <w:tblPrEx>
+          <w:tblCellMar>
+            <w:top w:w="0" w:type="dxa"/>
+            <w:bottom w:w="0" w:type="dxa"/>
+          </w:tblCellMar>
+        </w:tblPrEx>
         <w:tc>
           <w:tcPr>
-            <w:tcW w:type="pct" w:w="100%"/>
-            <w:shd w:fill="F0FDFA" w:val="clear"/>
+            <w:tcW w:w="5000" w:type="pct"/>
+            <w:shd w:val="clear" w:color="auto" w:fill="F0FDFA"/>
           </w:tcPr>
           <w:p>
             <w:r>
               <w:rPr>
-                <w:rFonts w:ascii="Segoe UI" w:cs="Segoe UI" w:eastAsia="Segoe UI" w:hAnsi="Segoe UI"/>
                 <w:b/>
                 <w:bCs/>
                 <w:color w:val="134E4A"/>
                 <w:sz w:val="22"/>
                 <w:szCs w:val="22"/>
               </w:rPr>
-              <w:t xml:space="preserve">🎤 SPEAKER 6 (Research &amp; Regulatory Lead)</w:t>
+              <w:t>🎤 SPEAKER 6 (Research &amp; Regulatory Lead)</w:t>
             </w:r>
             <w:r>
               <w:rPr>
-                <w:rFonts w:ascii="Segoe UI" w:cs="Segoe UI" w:eastAsia="Segoe UI" w:hAnsi="Segoe UI"/>
                 <w:b/>
                 <w:bCs/>
                 <w:color w:val="0284C7"/>
@@ -1487,17 +1468,15 @@
     </w:tbl>
     <w:p>
       <w:pPr>
-        <w:spacing w:after="50" w:before="100"/>
-      </w:pPr>
-      <w:r>
-        <w:rPr>
-          <w:b/>
-          <w:bCs/>
-          <w:color w:val="134E4A"/>
-          <w:sz w:val="20"/>
-          <w:szCs w:val="20"/>
-        </w:rPr>
-        <w:t xml:space="preserve">Spoken Script:</w:t>
+        <w:spacing w:before="100" w:after="50"/>
+      </w:pPr>
+      <w:r>
+        <w:rPr>
+          <w:b/>
+          <w:bCs/>
+          <w:color w:val="134E4A"/>
+        </w:rPr>
+        <w:t>Spoken Script:</w:t>
       </w:r>
     </w:p>
     <w:p>
@@ -1507,11 +1486,10 @@
           <w:ilvl w:val="0"/>
           <w:numId w:val="1"/>
         </w:numPr>
-        <w:spacing w:after="120" w:line="276"/>
-      </w:pPr>
-      <w:r>
-        <w:rPr>
-          <w:rFonts w:ascii="Segoe UI" w:cs="Segoe UI" w:eastAsia="Segoe UI" w:hAnsi="Segoe UI"/>
+        <w:spacing w:after="120" w:line="276" w:lineRule="auto"/>
+      </w:pPr>
+      <w:r>
+        <w:rPr>
           <w:b/>
           <w:bCs/>
           <w:color w:val="134E4A"/>
@@ -1522,12 +1500,10 @@
       </w:r>
       <w:r>
         <w:rPr>
-          <w:rFonts w:ascii="Segoe UI" w:cs="Segoe UI" w:eastAsia="Segoe UI" w:hAnsi="Segoe UI"/>
-          <w:color w:val="0F172A"/>
-          <w:sz w:val="21"/>
-          <w:szCs w:val="21"/>
-        </w:rPr>
-        <w:t xml:space="preserve">“Our platform design is directly grounded in Problem Statement 26133 by the Government of Maharashtra and policy frameworks from the National Health Mission.”</w:t>
+          <w:sz w:val="21"/>
+          <w:szCs w:val="21"/>
+        </w:rPr>
+        <w:t>“Our platform design is directly grounded in Problem Statement 26133 by the Government of Maharashtra and policy frameworks from the National Health Mission.”</w:t>
       </w:r>
     </w:p>
     <w:p>
@@ -1537,11 +1513,10 @@
           <w:ilvl w:val="0"/>
           <w:numId w:val="1"/>
         </w:numPr>
-        <w:spacing w:after="120" w:line="276"/>
-      </w:pPr>
-      <w:r>
-        <w:rPr>
-          <w:rFonts w:ascii="Segoe UI" w:cs="Segoe UI" w:eastAsia="Segoe UI" w:hAnsi="Segoe UI"/>
+        <w:spacing w:after="120" w:line="276" w:lineRule="auto"/>
+      </w:pPr>
+      <w:r>
+        <w:rPr>
           <w:b/>
           <w:bCs/>
           <w:color w:val="134E4A"/>
@@ -1552,12 +1527,10 @@
       </w:r>
       <w:r>
         <w:rPr>
-          <w:rFonts w:ascii="Segoe UI" w:cs="Segoe UI" w:eastAsia="Segoe UI" w:hAnsi="Segoe UI"/>
-          <w:color w:val="0F172A"/>
-          <w:sz w:val="21"/>
-          <w:szCs w:val="21"/>
-        </w:rPr>
-        <w:t xml:space="preserve">“We integrated official protocols from Ayushman Bharat PM-JAY, Mahatma Jyotirao Phule Jan Arogya Yojana (MJPJAY), and Maharashtra DVDMS (e-Aushadhi) Essential Medicines List standards.”</w:t>
+          <w:sz w:val="21"/>
+          <w:szCs w:val="21"/>
+        </w:rPr>
+        <w:t>“We integrated official protocols from Ayushman Bharat PM-JAY, Mahatma Jyotirao Phule Jan Arogya Yojana (MJPJAY), and Maharashtra DVDMS (e-Aushadhi) Essential Medicines List standards.”</w:t>
       </w:r>
     </w:p>
     <w:p>
@@ -1567,11 +1540,10 @@
           <w:ilvl w:val="0"/>
           <w:numId w:val="1"/>
         </w:numPr>
-        <w:spacing w:after="120" w:line="276"/>
-      </w:pPr>
-      <w:r>
-        <w:rPr>
-          <w:rFonts w:ascii="Segoe UI" w:cs="Segoe UI" w:eastAsia="Segoe UI" w:hAnsi="Segoe UI"/>
+        <w:spacing w:after="120" w:line="276" w:lineRule="auto"/>
+      </w:pPr>
+      <w:r>
+        <w:rPr>
           <w:b/>
           <w:bCs/>
           <w:color w:val="134E4A"/>
@@ -1582,21 +1554,18 @@
       </w:r>
       <w:r>
         <w:rPr>
-          <w:rFonts w:ascii="Segoe UI" w:cs="Segoe UI" w:eastAsia="Segoe UI" w:hAnsi="Segoe UI"/>
-          <w:color w:val="0F172A"/>
-          <w:sz w:val="21"/>
-          <w:szCs w:val="21"/>
-        </w:rPr>
-        <w:t xml:space="preserve">“Furthermore, our architecture aligns with Ayushman Bharat Digital Mission (ABDM) guidelines for digital health records, interoperability, and robust patient privacy with row-level security.”</w:t>
-      </w:r>
-    </w:p>
-    <w:p>
-      <w:pPr>
-        <w:spacing w:after="200" w:before="100"/>
-      </w:pPr>
-      <w:r>
-        <w:rPr>
-          <w:rFonts w:ascii="Segoe UI" w:cs="Segoe UI" w:eastAsia="Segoe UI" w:hAnsi="Segoe UI"/>
+          <w:sz w:val="21"/>
+          <w:szCs w:val="21"/>
+        </w:rPr>
+        <w:t>“Furthermore, our architecture aligns with Ayushman Bharat Digital Mission (ABDM) guidelines for digital health records, interoperability, and robust patient privacy with row-level security.”</w:t>
+      </w:r>
+    </w:p>
+    <w:p>
+      <w:pPr>
+        <w:spacing w:before="100" w:after="200"/>
+      </w:pPr>
+      <w:r>
+        <w:rPr>
           <w:b/>
           <w:bCs/>
           <w:color w:val="0284C7"/>
@@ -1607,69 +1576,74 @@
       </w:r>
       <w:r>
         <w:rPr>
-          <w:rFonts w:ascii="Segoe UI" w:cs="Segoe UI" w:eastAsia="Segoe UI" w:hAnsi="Segoe UI"/>
           <w:i/>
           <w:iCs/>
           <w:color w:val="475569"/>
           <w:sz w:val="18"/>
           <w:szCs w:val="18"/>
         </w:rPr>
-        <w:t xml:space="preserve">Show that the team understands government standards. Hand back to Speaker 1 / Entire Team for the final closing.</w:t>
+        <w:t>Show that the team understands government standards. Hand back to Speaker 1 / Entire Team for the final closing.</w:t>
       </w:r>
     </w:p>
     <w:p>
       <w:pPr>
         <w:pStyle w:val="Heading1"/>
-        <w:spacing w:after="150" w:before="300"/>
-      </w:pPr>
-      <w:r>
-        <w:rPr>
-          <w:rFonts w:ascii="Segoe UI" w:cs="Segoe UI" w:eastAsia="Segoe UI" w:hAnsi="Segoe UI"/>
+        <w:spacing w:before="300" w:after="150"/>
+      </w:pPr>
+      <w:r>
+        <w:rPr>
           <w:b/>
           <w:bCs/>
           <w:color w:val="134E4A"/>
           <w:sz w:val="26"/>
           <w:szCs w:val="26"/>
         </w:rPr>
-        <w:t xml:space="preserve">SLIDE Closing: FINAL SUMMARY &amp; CALL TO ACTION</w:t>
+        <w:t>SLIDE Closing: FINAL SUMMARY &amp; CALL TO ACTION</w:t>
       </w:r>
     </w:p>
     <w:tbl>
       <w:tblPr>
-        <w:tblW w:type="pct" w:w="100%"/>
+        <w:tblW w:w="5000" w:type="pct"/>
         <w:tblBorders>
-          <w:top w:val="none" w:color="auto" w:sz="0"/>
-          <w:left w:val="single" w:color="0F766E" w:sz="12"/>
-          <w:bottom w:val="single" w:color="0F766E" w:sz="4"/>
-          <w:right w:val="none" w:color="auto" w:sz="0"/>
-          <w:insideH w:val="single" w:color="auto" w:sz="4"/>
-          <w:insideV w:val="single" w:color="auto" w:sz="4"/>
+          <w:left w:val="single" w:sz="12" w:space="0" w:color="0F766E"/>
+          <w:bottom w:val="single" w:sz="4" w:space="0" w:color="0F766E"/>
+          <w:insideH w:val="single" w:sz="4" w:space="0" w:color="auto"/>
+          <w:insideV w:val="single" w:sz="4" w:space="0" w:color="auto"/>
         </w:tblBorders>
+        <w:tblCellMar>
+          <w:left w:w="10" w:type="dxa"/>
+          <w:right w:w="10" w:type="dxa"/>
+        </w:tblCellMar>
+        <w:tblLook w:val="0000" w:firstRow="0" w:lastRow="0" w:firstColumn="0" w:lastColumn="0" w:noHBand="0" w:noVBand="0"/>
       </w:tblPr>
       <w:tblGrid>
-        <w:gridCol w:w="100"/>
+        <w:gridCol w:w="9891"/>
       </w:tblGrid>
       <w:tr>
+        <w:tblPrEx>
+          <w:tblCellMar>
+            <w:top w:w="0" w:type="dxa"/>
+            <w:bottom w:w="0" w:type="dxa"/>
+          </w:tblCellMar>
+        </w:tblPrEx>
         <w:tc>
           <w:tcPr>
-            <w:tcW w:type="pct" w:w="100%"/>
-            <w:shd w:fill="F0FDFA" w:val="clear"/>
+            <w:tcW w:w="5000" w:type="pct"/>
+            <w:shd w:val="clear" w:color="auto" w:fill="F0FDFA"/>
           </w:tcPr>
           <w:p>
             <w:r>
               <w:rPr>
-                <w:rFonts w:ascii="Segoe UI" w:cs="Segoe UI" w:eastAsia="Segoe UI" w:hAnsi="Segoe UI"/>
                 <w:b/>
                 <w:bCs/>
                 <w:color w:val="134E4A"/>
                 <w:sz w:val="22"/>
                 <w:szCs w:val="22"/>
               </w:rPr>
-              <w:t xml:space="preserve">🎤 SPEAKER 1 &amp; ALL TEAM MEMBERS (Full Team Closing)</w:t>
+              <w:t>🎤 SPEAKER 1 &amp; ALL TEAM MEMBERS (Full Team Closing)</w:t>
             </w:r>
             <w:r>
               <w:rPr>
-                <w:rFonts w:ascii="Segoe UI" w:cs="Segoe UI" w:eastAsia="Segoe UI" w:hAnsi="Segoe UI"/>
                 <w:b/>
                 <w:bCs/>
                 <w:color w:val="0284C7"/>
@@ -1684,17 +1658,15 @@
     </w:tbl>
     <w:p>
       <w:pPr>
-        <w:spacing w:after="50" w:before="100"/>
-      </w:pPr>
-      <w:r>
-        <w:rPr>
-          <w:b/>
-          <w:bCs/>
-          <w:color w:val="134E4A"/>
-          <w:sz w:val="20"/>
-          <w:szCs w:val="20"/>
-        </w:rPr>
-        <w:t xml:space="preserve">Spoken Script:</w:t>
+        <w:spacing w:before="100" w:after="50"/>
+      </w:pPr>
+      <w:r>
+        <w:rPr>
+          <w:b/>
+          <w:bCs/>
+          <w:color w:val="134E4A"/>
+        </w:rPr>
+        <w:t>Spoken Script:</w:t>
       </w:r>
     </w:p>
     <w:p>
@@ -1704,11 +1676,10 @@
           <w:ilvl w:val="0"/>
           <w:numId w:val="1"/>
         </w:numPr>
-        <w:spacing w:after="120" w:line="276"/>
-      </w:pPr>
-      <w:r>
-        <w:rPr>
-          <w:rFonts w:ascii="Segoe UI" w:cs="Segoe UI" w:eastAsia="Segoe UI" w:hAnsi="Segoe UI"/>
+        <w:spacing w:after="120" w:line="276" w:lineRule="auto"/>
+      </w:pPr>
+      <w:r>
+        <w:rPr>
           <w:b/>
           <w:bCs/>
           <w:color w:val="134E4A"/>
@@ -1719,12 +1690,10 @@
       </w:r>
       <w:r>
         <w:rPr>
-          <w:rFonts w:ascii="Segoe UI" w:cs="Segoe UI" w:eastAsia="Segoe UI" w:hAnsi="Segoe UI"/>
-          <w:color w:val="0F172A"/>
-          <w:sz w:val="21"/>
-          <w:szCs w:val="21"/>
-        </w:rPr>
-        <w:t xml:space="preserve">“In summary, JeevanSetu transforms rural healthcare from a fragmented, uncertain struggle into a coordinated, transparent, and dignified experience — ensuring that geography never stands in the way of life-saving care.”</w:t>
+          <w:sz w:val="21"/>
+          <w:szCs w:val="21"/>
+        </w:rPr>
+        <w:t>“In summary, JeevanSetu transforms rural healthcare from a fragmented, uncertain struggle into a coordinated, transparent, and dignified experience — ensuring that geography never stands in the way of life-saving care.”</w:t>
       </w:r>
     </w:p>
     <w:p>
@@ -1734,11 +1703,10 @@
           <w:ilvl w:val="0"/>
           <w:numId w:val="1"/>
         </w:numPr>
-        <w:spacing w:after="120" w:line="276"/>
-      </w:pPr>
-      <w:r>
-        <w:rPr>
-          <w:rFonts w:ascii="Segoe UI" w:cs="Segoe UI" w:eastAsia="Segoe UI" w:hAnsi="Segoe UI"/>
+        <w:spacing w:after="120" w:line="276" w:lineRule="auto"/>
+      </w:pPr>
+      <w:r>
+        <w:rPr>
           <w:b/>
           <w:bCs/>
           <w:color w:val="134E4A"/>
@@ -1749,29 +1717,26 @@
       </w:r>
       <w:r>
         <w:rPr>
-          <w:rFonts w:ascii="Segoe UI" w:cs="Segoe UI" w:eastAsia="Segoe UI" w:hAnsi="Segoe UI"/>
-          <w:color w:val="0F172A"/>
-          <w:sz w:val="21"/>
-          <w:szCs w:val="21"/>
-        </w:rPr>
-        <w:t xml:space="preserve">“We are fully committed to deploying JeevanSetu in alignment with the Maharashtra State Innovation Society and the vision of Digital Health for India. Thank you, respected judges — we are now ready for your questions!”</w:t>
+          <w:sz w:val="21"/>
+          <w:szCs w:val="21"/>
+        </w:rPr>
+        <w:t>“We are fully committed to deploying JeevanSetu in alignment with the Maharashtra State Innovation Society and the vision of Digital Health for India. Thank you, respected judges — we are now ready for your questions!”</w:t>
       </w:r>
     </w:p>
     <w:p>
       <w:pPr>
         <w:pStyle w:val="Heading1"/>
-        <w:spacing w:after="150" w:before="400"/>
-      </w:pPr>
-      <w:r>
-        <w:rPr>
-          <w:rFonts w:ascii="Segoe UI" w:cs="Segoe UI" w:eastAsia="Segoe UI" w:hAnsi="Segoe UI"/>
+        <w:spacing w:before="400" w:after="150"/>
+      </w:pPr>
+      <w:r>
+        <w:rPr>
           <w:b/>
           <w:bCs/>
           <w:color w:val="134E4A"/>
           <w:sz w:val="24"/>
           <w:szCs w:val="24"/>
         </w:rPr>
-        <w:t xml:space="preserve">⚡ BONUS: RAPID-FIRE DEFENSE BANK (TOP 5 JUDGE QUESTIONS)</w:t>
+        <w:t>⚡ BONUS: RAPID-FIRE DEFENSE BANK (TOP 5 JUDGE QUESTIONS)</w:t>
       </w:r>
     </w:p>
     <w:p>
@@ -1781,27 +1746,25 @@
           <w:ilvl w:val="0"/>
           <w:numId w:val="1"/>
         </w:numPr>
-        <w:spacing w:after="120" w:line="276"/>
-      </w:pPr>
-      <w:r>
-        <w:rPr>
-          <w:rFonts w:ascii="Segoe UI" w:cs="Segoe UI" w:eastAsia="Segoe UI" w:hAnsi="Segoe UI"/>
-          <w:b/>
-          <w:bCs/>
-          <w:color w:val="134E4A"/>
-          <w:sz w:val="21"/>
-          <w:szCs w:val="21"/>
-        </w:rPr>
+        <w:spacing w:after="120" w:line="276" w:lineRule="auto"/>
+      </w:pPr>
+      <w:r>
+        <w:rPr>
+          <w:b/>
+          <w:bCs/>
+          <w:color w:val="134E4A"/>
+          <w:sz w:val="21"/>
+          <w:szCs w:val="21"/>
+        </w:rPr>
+        <w:lastRenderedPageBreak/>
         <w:t xml:space="preserve">Q1: What if your AI gives incorrect medical advice? </w:t>
       </w:r>
       <w:r>
         <w:rPr>
-          <w:rFonts w:ascii="Segoe UI" w:cs="Segoe UI" w:eastAsia="Segoe UI" w:hAnsi="Segoe UI"/>
-          <w:color w:val="0F172A"/>
-          <w:sz w:val="21"/>
-          <w:szCs w:val="21"/>
-        </w:rPr>
-        <w:t xml:space="preserve">Answer: 'JeevanSetu is strictly a logistical and resource coordination tool. It never prescribes drugs or gives diagnoses. All recommendations are bounded by verified government registries and official schemes.'</w:t>
+          <w:sz w:val="21"/>
+          <w:szCs w:val="21"/>
+        </w:rPr>
+        <w:t>Answer: 'JeevanSetu is strictly a logistical and resource coordination tool. It never prescribes drugs or gives diagnoses. All recommendations are bounded by verified government registries and official schemes.'</w:t>
       </w:r>
     </w:p>
     <w:p>
@@ -1811,11 +1774,10 @@
           <w:ilvl w:val="0"/>
           <w:numId w:val="1"/>
         </w:numPr>
-        <w:spacing w:after="120" w:line="276"/>
-      </w:pPr>
-      <w:r>
-        <w:rPr>
-          <w:rFonts w:ascii="Segoe UI" w:cs="Segoe UI" w:eastAsia="Segoe UI" w:hAnsi="Segoe UI"/>
+        <w:spacing w:after="120" w:line="276" w:lineRule="auto"/>
+      </w:pPr>
+      <w:r>
+        <w:rPr>
           <w:b/>
           <w:bCs/>
           <w:color w:val="134E4A"/>
@@ -1826,12 +1788,10 @@
       </w:r>
       <w:r>
         <w:rPr>
-          <w:rFonts w:ascii="Segoe UI" w:cs="Segoe UI" w:eastAsia="Segoe UI" w:hAnsi="Segoe UI"/>
-          <w:color w:val="0F172A"/>
-          <w:sz w:val="21"/>
-          <w:szCs w:val="21"/>
-        </w:rPr>
-        <w:t xml:space="preserve">Answer: 'We built a voice-first conversational interface in Marathi and Hindi with a 1-tap phone-call UI. For feature-phone users without internet, we have designed an automated IVR gateway.'</w:t>
+          <w:sz w:val="21"/>
+          <w:szCs w:val="21"/>
+        </w:rPr>
+        <w:t>Answer: 'We built a voice-first conversational interface in Marathi and Hindi with a 1-tap phone-call UI. For feature-phone users without internet, we have designed an automated IVR gateway.'</w:t>
       </w:r>
     </w:p>
     <w:p>
@@ -1841,11 +1801,10 @@
           <w:ilvl w:val="0"/>
           <w:numId w:val="1"/>
         </w:numPr>
-        <w:spacing w:after="120" w:line="276"/>
-      </w:pPr>
-      <w:r>
-        <w:rPr>
-          <w:rFonts w:ascii="Segoe UI" w:cs="Segoe UI" w:eastAsia="Segoe UI" w:hAnsi="Segoe UI"/>
+        <w:spacing w:after="120" w:line="276" w:lineRule="auto"/>
+      </w:pPr>
+      <w:r>
+        <w:rPr>
           <w:b/>
           <w:bCs/>
           <w:color w:val="134E4A"/>
@@ -1856,12 +1815,10 @@
       </w:r>
       <w:r>
         <w:rPr>
-          <w:rFonts w:ascii="Segoe UI" w:cs="Segoe UI" w:eastAsia="Segoe UI" w:hAnsi="Segoe UI"/>
-          <w:color w:val="0F172A"/>
-          <w:sz w:val="21"/>
-          <w:szCs w:val="21"/>
-        </w:rPr>
-        <w:t xml:space="preserve">Answer: 'JeevanSetu acts as an intelligent coordination overlay on top of existing databases like DVDMS and ABDM, adding real-time predictive stock alerts and multi-tier referral visibility without replacing legacy software.'</w:t>
+          <w:sz w:val="21"/>
+          <w:szCs w:val="21"/>
+        </w:rPr>
+        <w:t>Answer: 'JeevanSetu acts as an intelligent coordination overlay on top of existing databases like DVDMS and ABDM, adding real-time predictive stock alerts and multi-tier referral visibility without replacing legacy software.'</w:t>
       </w:r>
     </w:p>
     <w:p>
@@ -1871,11 +1828,10 @@
           <w:ilvl w:val="0"/>
           <w:numId w:val="1"/>
         </w:numPr>
-        <w:spacing w:after="120" w:line="276"/>
-      </w:pPr>
-      <w:r>
-        <w:rPr>
-          <w:rFonts w:ascii="Segoe UI" w:cs="Segoe UI" w:eastAsia="Segoe UI" w:hAnsi="Segoe UI"/>
+        <w:spacing w:after="120" w:line="276" w:lineRule="auto"/>
+      </w:pPr>
+      <w:r>
+        <w:rPr>
           <w:b/>
           <w:bCs/>
           <w:color w:val="134E4A"/>
@@ -1886,12 +1842,10 @@
       </w:r>
       <w:r>
         <w:rPr>
-          <w:rFonts w:ascii="Segoe UI" w:cs="Segoe UI" w:eastAsia="Segoe UI" w:hAnsi="Segoe UI"/>
-          <w:color w:val="0F172A"/>
-          <w:sz w:val="21"/>
-          <w:szCs w:val="21"/>
-        </w:rPr>
-        <w:t xml:space="preserve">Answer: 'We use a deterministic mathematical formula (Current Stock ÷ Average Daily Consumption) that calculates exact days of supply left, triggering automatic 5-day and 3-day buffer alerts before a stockout occurs.'</w:t>
+          <w:sz w:val="21"/>
+          <w:szCs w:val="21"/>
+        </w:rPr>
+        <w:t>Answer: 'We use a deterministic mathematical formula (Current Stock ÷ Average Daily Consumption) that calculates exact days of supply left, triggering automatic 5-day and 3-day buffer alerts before a stockout occurs.'</w:t>
       </w:r>
     </w:p>
     <w:p>
@@ -1901,11 +1855,10 @@
           <w:ilvl w:val="0"/>
           <w:numId w:val="1"/>
         </w:numPr>
-        <w:spacing w:after="120" w:line="276"/>
-      </w:pPr>
-      <w:r>
-        <w:rPr>
-          <w:rFonts w:ascii="Segoe UI" w:cs="Segoe UI" w:eastAsia="Segoe UI" w:hAnsi="Segoe UI"/>
+        <w:spacing w:after="120" w:line="276" w:lineRule="auto"/>
+      </w:pPr>
+      <w:r>
+        <w:rPr>
           <w:b/>
           <w:bCs/>
           <w:color w:val="134E4A"/>
@@ -1916,107 +1869,29 @@
       </w:r>
       <w:r>
         <w:rPr>
-          <w:rFonts w:ascii="Segoe UI" w:cs="Segoe UI" w:eastAsia="Segoe UI" w:hAnsi="Segoe UI"/>
-          <w:color w:val="0F172A"/>
-          <w:sz w:val="21"/>
-          <w:szCs w:val="21"/>
-        </w:rPr>
-        <w:t xml:space="preserve">Answer: 'Our prototype is 100% built and live today with authentic datasets for all 36 Maharashtra districts, 4 working role dashboards, live DVDMS sync, and a functional Marathi voice AI.'</w:t>
+          <w:sz w:val="21"/>
+          <w:szCs w:val="21"/>
+        </w:rPr>
+        <w:t>Answer: 'Our prototype is 100% built and live today with authentic datasets for all 36 Maharashtra districts, 4 working role dashboards, live DVDMS sync, and a functional Marathi voice AI.'</w:t>
       </w:r>
     </w:p>
     <w:sectPr>
-      <w:pgSz w:w="11906" w:h="16838" w:orient="portrait"/>
+      <w:pgSz w:w="11906" w:h="16838"/>
       <w:pgMar w:top="1000" w:right="1000" w:bottom="1000" w:left="1000" w:header="708" w:footer="708" w:gutter="0"/>
-      <w:pgNumType/>
+      <w:cols w:space="720"/>
       <w:docGrid w:linePitch="360"/>
     </w:sectPr>
   </w:body>
 </w:document>
 </file>
 
-<file path=word/comments.xml><?xml version="1.0" encoding="utf-8"?>
-<w:comments xmlns:cx="http://schemas.microsoft.com/office/drawing/2014/chartex" xmlns:cx1="http://schemas.microsoft.com/office/drawing/2015/9/8/chartex" xmlns:cx2="http://schemas.microsoft.com/office/drawing/2015/10/21/chartex" xmlns:cx3="http://schemas.microsoft.com/office/drawing/2016/5/9/chartex" xmlns:cx4="http://schemas.microsoft.com/office/drawing/2016/5/10/chartex" xmlns:cx5="http://schemas.microsoft.com/office/drawing/2016/5/11/chartex" xmlns:cx6="http://schemas.microsoft.com/office/drawing/2016/5/12/chartex" xmlns:cx7="http://schemas.microsoft.com/office/drawing/2016/5/13/chartex" xmlns:cx8="http://schemas.microsoft.com/office/drawing/2016/5/14/chartex" xmlns:mc="http://schemas.openxmlformats.org/markup-compatibility/2006" xmlns:aink="http://schemas.microsoft.com/office/drawing/2016/ink" xmlns:am3d="http://schemas.microsoft.com/office/drawing/2017/model3d" xmlns:o="urn:schemas-microsoft-com:office:office" xmlns:r="http://schemas.openxmlformats.org/officeDocument/2006/relationships" xmlns:m="http://schemas.openxmlformats.org/officeDocument/2006/math" xmlns:v="urn:schemas-microsoft-com:vml" xmlns:wp14="http://schemas.microsoft.com/office/word/2010/wordprocessingDrawing" xmlns:wp="http://schemas.openxmlformats.org/drawingml/2006/wordprocessingDrawing" xmlns:w10="urn:schemas-microsoft-com:office:word" xmlns:w="http://schemas.openxmlformats.org/wordprocessingml/2006/main" xmlns:w14="http://schemas.microsoft.com/office/word/2010/wordml" xmlns:w15="http://schemas.microsoft.com/office/word/2012/wordml" xmlns:w16cex="http://schemas.microsoft.com/office/word/2018/wordml/cex" xmlns:w16cid="http://schemas.microsoft.com/office/word/2016/wordml/cid" xmlns:w16="http://schemas.microsoft.com/office/word/2018/wordml" xmlns:w16sdtdh="http://schemas.microsoft.com/office/word/2020/wordml/sdtdatahash" xmlns:w16se="http://schemas.microsoft.com/office/word/2015/wordml/symex" xmlns:wpg="http://schemas.microsoft.com/office/word/2010/wordprocessingGroup" xmlns:wpi="http://schemas.microsoft.com/office/word/2010/wordprocessingInk" xmlns:wne="http://schemas.microsoft.com/office/word/2006/wordml" xmlns:wps="http://schemas.microsoft.com/office/word/2010/wordprocessingShape"/>
-</file>
-
-<file path=word/endnotes.xml><?xml version="1.0" encoding="utf-8"?>
-<w:endnotes xmlns:wpc="http://schemas.microsoft.com/office/word/2010/wordprocessingCanvas" xmlns:mc="http://schemas.openxmlformats.org/markup-compatibility/2006" xmlns:o="urn:schemas-microsoft-com:office:office" xmlns:r="http://schemas.openxmlformats.org/officeDocument/2006/relationships" xmlns:m="http://schemas.openxmlformats.org/officeDocument/2006/math" xmlns:v="urn:schemas-microsoft-com:vml" xmlns:wp14="http://schemas.microsoft.com/office/word/2010/wordprocessingDrawing" xmlns:wp="http://schemas.openxmlformats.org/drawingml/2006/wordprocessingDrawing" xmlns:w10="urn:schemas-microsoft-com:office:word" xmlns:w="http://schemas.openxmlformats.org/wordprocessingml/2006/main" xmlns:w14="http://schemas.microsoft.com/office/word/2010/wordml" xmlns:w15="http://schemas.microsoft.com/office/word/2012/wordml" xmlns:wpg="http://schemas.microsoft.com/office/word/2010/wordprocessingGroup" xmlns:wpi="http://schemas.microsoft.com/office/word/2010/wordprocessingInk" xmlns:wne="http://schemas.microsoft.com/office/word/2006/wordml" xmlns:wps="http://schemas.microsoft.com/office/word/2010/wordprocessingShape" mc:Ignorable="w14 w15 wp14">
-  <w:endnote w:type="separator" w:id="-1">
-    <w:p>
-      <w:pPr>
-        <w:spacing w:after="0" w:line="240" w:lineRule="auto"/>
-      </w:pPr>
-      <w:r>
-        <w:rPr>
-          <w:rStyle w:val="EndnoteReference"/>
-        </w:rPr>
-        <w:endnoteRef/>
-      </w:r>
-      <w:r>
-        <w:separator/>
-      </w:r>
-    </w:p>
-  </w:endnote>
-  <w:endnote w:type="continuationSeparator" w:id="0">
-    <w:p>
-      <w:pPr>
-        <w:spacing w:after="0" w:line="240" w:lineRule="auto"/>
-      </w:pPr>
-      <w:r>
-        <w:rPr>
-          <w:rStyle w:val="EndnoteReference"/>
-        </w:rPr>
-        <w:endnoteRef/>
-      </w:r>
-      <w:r>
-        <w:continuationSeparator/>
-      </w:r>
-    </w:p>
-  </w:endnote>
-</w:endnotes>
-</file>
-
-<file path=word/footnotes.xml><?xml version="1.0" encoding="utf-8"?>
-<w:footnotes xmlns:wpc="http://schemas.microsoft.com/office/word/2010/wordprocessingCanvas" xmlns:mc="http://schemas.openxmlformats.org/markup-compatibility/2006" xmlns:o="urn:schemas-microsoft-com:office:office" xmlns:r="http://schemas.openxmlformats.org/officeDocument/2006/relationships" xmlns:m="http://schemas.openxmlformats.org/officeDocument/2006/math" xmlns:v="urn:schemas-microsoft-com:vml" xmlns:wp14="http://schemas.microsoft.com/office/word/2010/wordprocessingDrawing" xmlns:wp="http://schemas.openxmlformats.org/drawingml/2006/wordprocessingDrawing" xmlns:w10="urn:schemas-microsoft-com:office:word" xmlns:w="http://schemas.openxmlformats.org/wordprocessingml/2006/main" xmlns:w14="http://schemas.microsoft.com/office/word/2010/wordml" xmlns:w15="http://schemas.microsoft.com/office/word/2012/wordml" xmlns:wpg="http://schemas.microsoft.com/office/word/2010/wordprocessingGroup" xmlns:wpi="http://schemas.microsoft.com/office/word/2010/wordprocessingInk" xmlns:wne="http://schemas.microsoft.com/office/word/2006/wordml" xmlns:wps="http://schemas.microsoft.com/office/word/2010/wordprocessingShape" mc:Ignorable="w14 w15 wp14">
-  <w:footnote w:type="separator" w:id="-1">
-    <w:p>
-      <w:pPr>
-        <w:spacing w:after="0" w:line="240" w:lineRule="auto"/>
-      </w:pPr>
-      <w:r>
-        <w:rPr>
-          <w:rStyle w:val="FootnoteReference"/>
-        </w:rPr>
-        <w:footnoteRef/>
-      </w:r>
-      <w:r>
-        <w:separator/>
-      </w:r>
-    </w:p>
-  </w:footnote>
-  <w:footnote w:type="continuationSeparator" w:id="0">
-    <w:p>
-      <w:pPr>
-        <w:spacing w:after="0" w:line="240" w:lineRule="auto"/>
-      </w:pPr>
-      <w:r>
-        <w:rPr>
-          <w:rStyle w:val="FootnoteReference"/>
-        </w:rPr>
-        <w:footnoteRef/>
-      </w:r>
-      <w:r>
-        <w:continuationSeparator/>
-      </w:r>
-    </w:p>
-  </w:footnote>
-</w:footnotes>
-</file>
-
 <file path=word/numbering.xml><?xml version="1.0" encoding="utf-8"?>
-<w:numbering xmlns:wpc="http://schemas.microsoft.com/office/word/2010/wordprocessingCanvas" xmlns:mc="http://schemas.openxmlformats.org/markup-compatibility/2006" xmlns:o="urn:schemas-microsoft-com:office:office" xmlns:r="http://schemas.openxmlformats.org/officeDocument/2006/relationships" xmlns:m="http://schemas.openxmlformats.org/officeDocument/2006/math" xmlns:v="urn:schemas-microsoft-com:vml" xmlns:wp14="http://schemas.microsoft.com/office/word/2010/wordprocessingDrawing" xmlns:wp="http://schemas.openxmlformats.org/drawingml/2006/wordprocessingDrawing" xmlns:w10="urn:schemas-microsoft-com:office:word" xmlns:w="http://schemas.openxmlformats.org/wordprocessingml/2006/main" xmlns:w14="http://schemas.microsoft.com/office/word/2010/wordml" xmlns:w15="http://schemas.microsoft.com/office/word/2012/wordml" xmlns:wpg="http://schemas.microsoft.com/office/word/2010/wordprocessingGroup" xmlns:wpi="http://schemas.microsoft.com/office/word/2010/wordprocessingInk" xmlns:wne="http://schemas.microsoft.com/office/word/2006/wordml" xmlns:wps="http://schemas.microsoft.com/office/word/2010/wordprocessingShape" mc:Ignorable="w14 w15 wp14">
-  <w:abstractNum w:abstractNumId="1" w15:restartNumberingAfterBreak="0">
+<w:numbering xmlns:wpc="http://schemas.microsoft.com/office/word/2010/wordprocessingCanvas" xmlns:cx="http://schemas.microsoft.com/office/drawing/2014/chartex" xmlns:cx1="http://schemas.microsoft.com/office/drawing/2015/9/8/chartex" xmlns:cx2="http://schemas.microsoft.com/office/drawing/2015/10/21/chartex" xmlns:cx3="http://schemas.microsoft.com/office/drawing/2016/5/9/chartex" xmlns:cx4="http://schemas.microsoft.com/office/drawing/2016/5/10/chartex" xmlns:cx5="http://schemas.microsoft.com/office/drawing/2016/5/11/chartex" xmlns:cx6="http://schemas.microsoft.com/office/drawing/2016/5/12/chartex" xmlns:cx7="http://schemas.microsoft.com/office/drawing/2016/5/13/chartex" xmlns:cx8="http://schemas.microsoft.com/office/drawing/2016/5/14/chartex" xmlns:mc="http://schemas.openxmlformats.org/markup-compatibility/2006" xmlns:aink="http://schemas.microsoft.com/office/drawing/2016/ink" xmlns:am3d="http://schemas.microsoft.com/office/drawing/2017/model3d" xmlns:o="urn:schemas-microsoft-com:office:office" xmlns:oel="http://schemas.microsoft.com/office/2019/extlst" xmlns:r="http://schemas.openxmlformats.org/officeDocument/2006/relationships" xmlns:m="http://schemas.openxmlformats.org/officeDocument/2006/math" xmlns:v="urn:schemas-microsoft-com:vml" xmlns:wp14="http://schemas.microsoft.com/office/word/2010/wordprocessingDrawing" xmlns:wp="http://schemas.openxmlformats.org/drawingml/2006/wordprocessingDrawing" xmlns:w10="urn:schemas-microsoft-com:office:word" xmlns:w="http://schemas.openxmlformats.org/wordprocessingml/2006/main" xmlns:w14="http://schemas.microsoft.com/office/word/2010/wordml" xmlns:w15="http://schemas.microsoft.com/office/word/2012/wordml" xmlns:w16cex="http://schemas.microsoft.com/office/word/2018/wordml/cex" xmlns:w16cid="http://schemas.microsoft.com/office/word/2016/wordml/cid" xmlns:w16="http://schemas.microsoft.com/office/word/2018/wordml" xmlns:w16du="http://schemas.microsoft.com/office/word/2023/wordml/word16du" xmlns:w16sdtdh="http://schemas.microsoft.com/office/word/2020/wordml/sdtdatahash" xmlns:w16sdtfl="http://schemas.microsoft.com/office/word/2024/wordml/sdtformatlock" xmlns:w16se="http://schemas.microsoft.com/office/word/2015/wordml/symex" xmlns:wpg="http://schemas.microsoft.com/office/word/2010/wordprocessingGroup" xmlns:wpi="http://schemas.microsoft.com/office/word/2010/wordprocessingInk" xmlns:wne="http://schemas.microsoft.com/office/word/2006/wordml" xmlns:wps="http://schemas.microsoft.com/office/word/2010/wordprocessingShape" mc:Ignorable="w14 w15 w16se w16cid w16 w16cex w16sdtdh w16sdtfl w16du wp14">
+  <w:abstractNum w:abstractNumId="0" w15:restartNumberingAfterBreak="0">
+    <w:nsid w:val="3BF43BB2"/>
     <w:multiLevelType w:val="hybridMultilevel"/>
-    <w:lvl w:ilvl="0" w15:tentative="1">
+    <w:tmpl w:val="50CC220A"/>
+    <w:lvl w:ilvl="0" w:tplc="571A14A6">
       <w:start w:val="1"/>
       <w:numFmt w:val="bullet"/>
       <w:lvlText w:val="●"/>
@@ -2025,7 +1900,7 @@
         <w:ind w:left="720" w:hanging="360"/>
       </w:pPr>
     </w:lvl>
-    <w:lvl w:ilvl="1" w15:tentative="1">
+    <w:lvl w:ilvl="1" w:tplc="82F8D0CA">
       <w:start w:val="1"/>
       <w:numFmt w:val="bullet"/>
       <w:lvlText w:val="○"/>
@@ -2034,7 +1909,7 @@
         <w:ind w:left="1440" w:hanging="360"/>
       </w:pPr>
     </w:lvl>
-    <w:lvl w:ilvl="2" w15:tentative="1">
+    <w:lvl w:ilvl="2" w:tplc="930A5124">
       <w:start w:val="1"/>
       <w:numFmt w:val="bullet"/>
       <w:lvlText w:val="■"/>
@@ -2043,7 +1918,7 @@
         <w:ind w:left="2160" w:hanging="360"/>
       </w:pPr>
     </w:lvl>
-    <w:lvl w:ilvl="3" w15:tentative="1">
+    <w:lvl w:ilvl="3" w:tplc="6368F946">
       <w:start w:val="1"/>
       <w:numFmt w:val="bullet"/>
       <w:lvlText w:val="●"/>
@@ -2052,7 +1927,7 @@
         <w:ind w:left="2880" w:hanging="360"/>
       </w:pPr>
     </w:lvl>
-    <w:lvl w:ilvl="4" w15:tentative="1">
+    <w:lvl w:ilvl="4" w:tplc="83F847DC">
       <w:start w:val="1"/>
       <w:numFmt w:val="bullet"/>
       <w:lvlText w:val="○"/>
@@ -2061,7 +1936,7 @@
         <w:ind w:left="3600" w:hanging="360"/>
       </w:pPr>
     </w:lvl>
-    <w:lvl w:ilvl="5" w15:tentative="1">
+    <w:lvl w:ilvl="5" w:tplc="328221C2">
       <w:start w:val="1"/>
       <w:numFmt w:val="bullet"/>
       <w:lvlText w:val="■"/>
@@ -2070,7 +1945,7 @@
         <w:ind w:left="4320" w:hanging="360"/>
       </w:pPr>
     </w:lvl>
-    <w:lvl w:ilvl="6" w15:tentative="1">
+    <w:lvl w:ilvl="6" w:tplc="5B0E86FE">
       <w:start w:val="1"/>
       <w:numFmt w:val="bullet"/>
       <w:lvlText w:val="●"/>
@@ -2079,7 +1954,7 @@
         <w:ind w:left="5040" w:hanging="360"/>
       </w:pPr>
     </w:lvl>
-    <w:lvl w:ilvl="7" w15:tentative="1">
+    <w:lvl w:ilvl="7" w:tplc="326CA9B0">
       <w:start w:val="1"/>
       <w:numFmt w:val="bullet"/>
       <w:lvlText w:val="●"/>
@@ -2088,7 +1963,7 @@
         <w:ind w:left="5760" w:hanging="360"/>
       </w:pPr>
     </w:lvl>
-    <w:lvl w:ilvl="8" w15:tentative="1">
+    <w:lvl w:ilvl="8" w:tplc="37A8BB7E">
       <w:start w:val="1"/>
       <w:numFmt w:val="bullet"/>
       <w:lvlText w:val="●"/>
@@ -2098,8 +1973,8 @@
       </w:pPr>
     </w:lvl>
   </w:abstractNum>
-  <w:num w:numId="1">
-    <w:abstractNumId w:val="1"/>
+  <w:num w:numId="1" w16cid:durableId="1397970005">
+    <w:abstractNumId w:val="0"/>
     <w:lvlOverride w:ilvl="0">
       <w:startOverride w:val="1"/>
     </w:lvlOverride>
@@ -2108,31 +1983,406 @@
 </file>
 
 <file path=word/styles.xml><?xml version="1.0" encoding="utf-8"?>
-<w:styles xmlns:mc="http://schemas.openxmlformats.org/markup-compatibility/2006" xmlns:r="http://schemas.openxmlformats.org/officeDocument/2006/relationships" xmlns:w="http://schemas.openxmlformats.org/wordprocessingml/2006/main" xmlns:w14="http://schemas.microsoft.com/office/word/2010/wordml" xmlns:w15="http://schemas.microsoft.com/office/word/2012/wordml" mc:Ignorable="w14 w15">
+<w:styles xmlns:mc="http://schemas.openxmlformats.org/markup-compatibility/2006" xmlns:r="http://schemas.openxmlformats.org/officeDocument/2006/relationships" xmlns:w="http://schemas.openxmlformats.org/wordprocessingml/2006/main" xmlns:w14="http://schemas.microsoft.com/office/word/2010/wordml" xmlns:w15="http://schemas.microsoft.com/office/word/2012/wordml" xmlns:w16cex="http://schemas.microsoft.com/office/word/2018/wordml/cex" xmlns:w16cid="http://schemas.microsoft.com/office/word/2016/wordml/cid" xmlns:w16="http://schemas.microsoft.com/office/word/2018/wordml" xmlns:w16du="http://schemas.microsoft.com/office/word/2023/wordml/word16du" xmlns:w16sdtdh="http://schemas.microsoft.com/office/word/2020/wordml/sdtdatahash" xmlns:w16sdtfl="http://schemas.microsoft.com/office/word/2024/wordml/sdtformatlock" xmlns:w16se="http://schemas.microsoft.com/office/word/2015/wordml/symex" mc:Ignorable="w14 w15 w16se w16cid w16 w16cex w16sdtdh w16sdtfl w16du">
   <w:docDefaults>
     <w:rPrDefault>
       <w:rPr>
-        <w:rFonts w:ascii="Segoe UI" w:cs="Segoe UI" w:eastAsia="Segoe UI" w:hAnsi="Segoe UI"/>
+        <w:rFonts w:ascii="Segoe UI" w:eastAsia="Segoe UI" w:hAnsi="Segoe UI" w:cs="Segoe UI"/>
         <w:color w:val="0F172A"/>
+        <w:lang w:val="en-US" w:eastAsia="en-US" w:bidi="ar-SA"/>
       </w:rPr>
     </w:rPrDefault>
     <w:pPrDefault/>
   </w:docDefaults>
-  <w:style w:type="paragraph" w:styleId="Title">
-    <w:name w:val="Title"/>
-    <w:basedOn w:val="Normal"/>
-    <w:next w:val="Normal"/>
+  <w:latentStyles w:defLockedState="0" w:defUIPriority="99" w:defSemiHidden="0" w:defUnhideWhenUsed="0" w:defQFormat="0" w:count="376">
+    <w:lsdException w:name="Normal" w:uiPriority="0" w:qFormat="1"/>
+    <w:lsdException w:name="heading 1" w:uiPriority="9" w:qFormat="1"/>
+    <w:lsdException w:name="heading 2" w:semiHidden="1" w:uiPriority="9" w:unhideWhenUsed="1" w:qFormat="1"/>
+    <w:lsdException w:name="heading 3" w:semiHidden="1" w:uiPriority="9" w:unhideWhenUsed="1" w:qFormat="1"/>
+    <w:lsdException w:name="heading 4" w:semiHidden="1" w:uiPriority="9" w:unhideWhenUsed="1" w:qFormat="1"/>
+    <w:lsdException w:name="heading 5" w:semiHidden="1" w:uiPriority="9" w:unhideWhenUsed="1" w:qFormat="1"/>
+    <w:lsdException w:name="heading 6" w:semiHidden="1" w:uiPriority="9" w:unhideWhenUsed="1" w:qFormat="1"/>
+    <w:lsdException w:name="heading 7" w:semiHidden="1" w:uiPriority="9" w:unhideWhenUsed="1" w:qFormat="1"/>
+    <w:lsdException w:name="heading 8" w:semiHidden="1" w:uiPriority="9" w:unhideWhenUsed="1" w:qFormat="1"/>
+    <w:lsdException w:name="heading 9" w:semiHidden="1" w:uiPriority="9" w:unhideWhenUsed="1" w:qFormat="1"/>
+    <w:lsdException w:name="index 1" w:semiHidden="1" w:unhideWhenUsed="1"/>
+    <w:lsdException w:name="index 2" w:semiHidden="1" w:unhideWhenUsed="1"/>
+    <w:lsdException w:name="index 3" w:semiHidden="1" w:unhideWhenUsed="1"/>
+    <w:lsdException w:name="index 4" w:semiHidden="1" w:unhideWhenUsed="1"/>
+    <w:lsdException w:name="index 5" w:semiHidden="1" w:unhideWhenUsed="1"/>
+    <w:lsdException w:name="index 6" w:semiHidden="1" w:unhideWhenUsed="1"/>
+    <w:lsdException w:name="index 7" w:semiHidden="1" w:unhideWhenUsed="1"/>
+    <w:lsdException w:name="index 8" w:semiHidden="1" w:unhideWhenUsed="1"/>
+    <w:lsdException w:name="index 9" w:semiHidden="1" w:unhideWhenUsed="1"/>
+    <w:lsdException w:name="toc 1" w:semiHidden="1" w:uiPriority="39" w:unhideWhenUsed="1"/>
+    <w:lsdException w:name="toc 2" w:semiHidden="1" w:uiPriority="39" w:unhideWhenUsed="1"/>
+    <w:lsdException w:name="toc 3" w:semiHidden="1" w:uiPriority="39" w:unhideWhenUsed="1"/>
+    <w:lsdException w:name="toc 4" w:semiHidden="1" w:uiPriority="39" w:unhideWhenUsed="1"/>
+    <w:lsdException w:name="toc 5" w:semiHidden="1" w:uiPriority="39" w:unhideWhenUsed="1"/>
+    <w:lsdException w:name="toc 6" w:semiHidden="1" w:uiPriority="39" w:unhideWhenUsed="1"/>
+    <w:lsdException w:name="toc 7" w:semiHidden="1" w:uiPriority="39" w:unhideWhenUsed="1"/>
+    <w:lsdException w:name="toc 8" w:semiHidden="1" w:uiPriority="39" w:unhideWhenUsed="1"/>
+    <w:lsdException w:name="toc 9" w:semiHidden="1" w:uiPriority="39" w:unhideWhenUsed="1"/>
+    <w:lsdException w:name="Normal Indent" w:semiHidden="1" w:unhideWhenUsed="1"/>
+    <w:lsdException w:name="footnote text" w:semiHidden="1" w:unhideWhenUsed="1"/>
+    <w:lsdException w:name="annotation text" w:semiHidden="1" w:unhideWhenUsed="1"/>
+    <w:lsdException w:name="header" w:semiHidden="1" w:unhideWhenUsed="1"/>
+    <w:lsdException w:name="footer" w:semiHidden="1" w:unhideWhenUsed="1"/>
+    <w:lsdException w:name="index heading" w:semiHidden="1" w:unhideWhenUsed="1"/>
+    <w:lsdException w:name="caption" w:semiHidden="1" w:uiPriority="35" w:unhideWhenUsed="1" w:qFormat="1"/>
+    <w:lsdException w:name="table of figures" w:semiHidden="1" w:unhideWhenUsed="1"/>
+    <w:lsdException w:name="envelope address" w:semiHidden="1" w:unhideWhenUsed="1"/>
+    <w:lsdException w:name="envelope return" w:semiHidden="1" w:unhideWhenUsed="1"/>
+    <w:lsdException w:name="footnote reference" w:semiHidden="1" w:unhideWhenUsed="1"/>
+    <w:lsdException w:name="annotation reference" w:semiHidden="1" w:unhideWhenUsed="1"/>
+    <w:lsdException w:name="line number" w:semiHidden="1" w:unhideWhenUsed="1"/>
+    <w:lsdException w:name="page number" w:semiHidden="1" w:unhideWhenUsed="1"/>
+    <w:lsdException w:name="endnote reference" w:semiHidden="1" w:unhideWhenUsed="1"/>
+    <w:lsdException w:name="endnote text" w:semiHidden="1" w:unhideWhenUsed="1"/>
+    <w:lsdException w:name="table of authorities" w:semiHidden="1" w:unhideWhenUsed="1"/>
+    <w:lsdException w:name="macro" w:semiHidden="1" w:unhideWhenUsed="1"/>
+    <w:lsdException w:name="toa heading" w:semiHidden="1" w:unhideWhenUsed="1"/>
+    <w:lsdException w:name="List" w:semiHidden="1" w:unhideWhenUsed="1"/>
+    <w:lsdException w:name="List Bullet" w:semiHidden="1" w:unhideWhenUsed="1"/>
+    <w:lsdException w:name="List Number" w:semiHidden="1" w:unhideWhenUsed="1"/>
+    <w:lsdException w:name="List 2" w:semiHidden="1" w:unhideWhenUsed="1"/>
+    <w:lsdException w:name="List 3" w:semiHidden="1" w:unhideWhenUsed="1"/>
+    <w:lsdException w:name="List 4" w:semiHidden="1" w:unhideWhenUsed="1"/>
+    <w:lsdException w:name="List 5" w:semiHidden="1" w:unhideWhenUsed="1"/>
+    <w:lsdException w:name="List Bullet 2" w:semiHidden="1" w:unhideWhenUsed="1"/>
+    <w:lsdException w:name="List Bullet 3" w:semiHidden="1" w:unhideWhenUsed="1"/>
+    <w:lsdException w:name="List Bullet 4" w:semiHidden="1" w:unhideWhenUsed="1"/>
+    <w:lsdException w:name="List Bullet 5" w:semiHidden="1" w:unhideWhenUsed="1"/>
+    <w:lsdException w:name="List Number 2" w:semiHidden="1" w:unhideWhenUsed="1"/>
+    <w:lsdException w:name="List Number 3" w:semiHidden="1" w:unhideWhenUsed="1"/>
+    <w:lsdException w:name="List Number 4" w:semiHidden="1" w:unhideWhenUsed="1"/>
+    <w:lsdException w:name="List Number 5" w:semiHidden="1" w:unhideWhenUsed="1"/>
+    <w:lsdException w:name="Title" w:uiPriority="10" w:qFormat="1"/>
+    <w:lsdException w:name="Closing" w:semiHidden="1" w:unhideWhenUsed="1"/>
+    <w:lsdException w:name="Signature" w:semiHidden="1" w:unhideWhenUsed="1"/>
+    <w:lsdException w:name="Default Paragraph Font" w:semiHidden="1" w:uiPriority="1" w:unhideWhenUsed="1"/>
+    <w:lsdException w:name="Body Text" w:semiHidden="1" w:unhideWhenUsed="1"/>
+    <w:lsdException w:name="Body Text Indent" w:semiHidden="1" w:unhideWhenUsed="1"/>
+    <w:lsdException w:name="List Continue" w:semiHidden="1" w:unhideWhenUsed="1"/>
+    <w:lsdException w:name="List Continue 2" w:semiHidden="1" w:unhideWhenUsed="1"/>
+    <w:lsdException w:name="List Continue 3" w:semiHidden="1" w:unhideWhenUsed="1"/>
+    <w:lsdException w:name="List Continue 4" w:semiHidden="1" w:unhideWhenUsed="1"/>
+    <w:lsdException w:name="List Continue 5" w:semiHidden="1" w:unhideWhenUsed="1"/>
+    <w:lsdException w:name="Message Header" w:semiHidden="1" w:unhideWhenUsed="1"/>
+    <w:lsdException w:name="Subtitle" w:uiPriority="11" w:qFormat="1"/>
+    <w:lsdException w:name="Salutation" w:semiHidden="1" w:unhideWhenUsed="1"/>
+    <w:lsdException w:name="Date" w:semiHidden="1" w:unhideWhenUsed="1"/>
+    <w:lsdException w:name="Body Text First Indent" w:semiHidden="1" w:unhideWhenUsed="1"/>
+    <w:lsdException w:name="Body Text First Indent 2" w:semiHidden="1" w:unhideWhenUsed="1"/>
+    <w:lsdException w:name="Note Heading" w:semiHidden="1" w:unhideWhenUsed="1"/>
+    <w:lsdException w:name="Body Text 2" w:semiHidden="1" w:unhideWhenUsed="1"/>
+    <w:lsdException w:name="Body Text 3" w:semiHidden="1" w:unhideWhenUsed="1"/>
+    <w:lsdException w:name="Body Text Indent 2" w:semiHidden="1" w:unhideWhenUsed="1"/>
+    <w:lsdException w:name="Body Text Indent 3" w:semiHidden="1" w:unhideWhenUsed="1"/>
+    <w:lsdException w:name="Block Text" w:semiHidden="1" w:unhideWhenUsed="1"/>
+    <w:lsdException w:name="Hyperlink" w:semiHidden="1" w:unhideWhenUsed="1"/>
+    <w:lsdException w:name="FollowedHyperlink" w:semiHidden="1" w:unhideWhenUsed="1"/>
+    <w:lsdException w:name="Strong" w:uiPriority="22" w:qFormat="1"/>
+    <w:lsdException w:name="Emphasis" w:uiPriority="20" w:qFormat="1"/>
+    <w:lsdException w:name="Document Map" w:semiHidden="1" w:unhideWhenUsed="1"/>
+    <w:lsdException w:name="Plain Text" w:semiHidden="1" w:unhideWhenUsed="1"/>
+    <w:lsdException w:name="E-mail Signature" w:semiHidden="1" w:unhideWhenUsed="1"/>
+    <w:lsdException w:name="HTML Top of Form" w:semiHidden="1" w:unhideWhenUsed="1"/>
+    <w:lsdException w:name="HTML Bottom of Form" w:semiHidden="1" w:unhideWhenUsed="1"/>
+    <w:lsdException w:name="Normal (Web)" w:semiHidden="1" w:unhideWhenUsed="1"/>
+    <w:lsdException w:name="HTML Acronym" w:semiHidden="1" w:unhideWhenUsed="1"/>
+    <w:lsdException w:name="HTML Address" w:semiHidden="1" w:unhideWhenUsed="1"/>
+    <w:lsdException w:name="HTML Cite" w:semiHidden="1" w:unhideWhenUsed="1"/>
+    <w:lsdException w:name="HTML Code" w:semiHidden="1" w:unhideWhenUsed="1"/>
+    <w:lsdException w:name="HTML Definition" w:semiHidden="1" w:unhideWhenUsed="1"/>
+    <w:lsdException w:name="HTML Keyboard" w:semiHidden="1" w:unhideWhenUsed="1"/>
+    <w:lsdException w:name="HTML Preformatted" w:semiHidden="1" w:unhideWhenUsed="1"/>
+    <w:lsdException w:name="HTML Sample" w:semiHidden="1" w:unhideWhenUsed="1"/>
+    <w:lsdException w:name="HTML Typewriter" w:semiHidden="1" w:unhideWhenUsed="1"/>
+    <w:lsdException w:name="HTML Variable" w:semiHidden="1" w:unhideWhenUsed="1"/>
+    <w:lsdException w:name="Normal Table" w:semiHidden="1" w:unhideWhenUsed="1"/>
+    <w:lsdException w:name="annotation subject" w:semiHidden="1" w:unhideWhenUsed="1"/>
+    <w:lsdException w:name="No List" w:semiHidden="1" w:unhideWhenUsed="1"/>
+    <w:lsdException w:name="Outline List 1" w:semiHidden="1" w:unhideWhenUsed="1"/>
+    <w:lsdException w:name="Outline List 2" w:semiHidden="1" w:unhideWhenUsed="1"/>
+    <w:lsdException w:name="Outline List 3" w:semiHidden="1" w:unhideWhenUsed="1"/>
+    <w:lsdException w:name="Table Simple 1" w:semiHidden="1" w:unhideWhenUsed="1"/>
+    <w:lsdException w:name="Table Simple 2" w:semiHidden="1" w:unhideWhenUsed="1"/>
+    <w:lsdException w:name="Table Simple 3" w:semiHidden="1" w:unhideWhenUsed="1"/>
+    <w:lsdException w:name="Table Classic 1" w:semiHidden="1" w:unhideWhenUsed="1"/>
+    <w:lsdException w:name="Table Classic 2" w:semiHidden="1" w:unhideWhenUsed="1"/>
+    <w:lsdException w:name="Table Classic 3" w:semiHidden="1" w:unhideWhenUsed="1"/>
+    <w:lsdException w:name="Table Classic 4" w:semiHidden="1" w:unhideWhenUsed="1"/>
+    <w:lsdException w:name="Table Colorful 1" w:semiHidden="1" w:unhideWhenUsed="1"/>
+    <w:lsdException w:name="Table Colorful 2" w:semiHidden="1" w:unhideWhenUsed="1"/>
+    <w:lsdException w:name="Table Colorful 3" w:semiHidden="1" w:unhideWhenUsed="1"/>
+    <w:lsdException w:name="Table Columns 1" w:semiHidden="1" w:unhideWhenUsed="1"/>
+    <w:lsdException w:name="Table Columns 2" w:semiHidden="1" w:unhideWhenUsed="1"/>
+    <w:lsdException w:name="Table Columns 3" w:semiHidden="1" w:unhideWhenUsed="1"/>
+    <w:lsdException w:name="Table Columns 4" w:semiHidden="1" w:unhideWhenUsed="1"/>
+    <w:lsdException w:name="Table Columns 5" w:semiHidden="1" w:unhideWhenUsed="1"/>
+    <w:lsdException w:name="Table Grid 1" w:semiHidden="1" w:unhideWhenUsed="1"/>
+    <w:lsdException w:name="Table Grid 2" w:semiHidden="1" w:unhideWhenUsed="1"/>
+    <w:lsdException w:name="Table Grid 3" w:semiHidden="1" w:unhideWhenUsed="1"/>
+    <w:lsdException w:name="Table Grid 4" w:semiHidden="1" w:unhideWhenUsed="1"/>
+    <w:lsdException w:name="Table Grid 5" w:semiHidden="1" w:unhideWhenUsed="1"/>
+    <w:lsdException w:name="Table Grid 6" w:semiHidden="1" w:unhideWhenUsed="1"/>
+    <w:lsdException w:name="Table Grid 7" w:semiHidden="1" w:unhideWhenUsed="1"/>
+    <w:lsdException w:name="Table Grid 8" w:semiHidden="1" w:unhideWhenUsed="1"/>
+    <w:lsdException w:name="Table List 1" w:semiHidden="1" w:unhideWhenUsed="1"/>
+    <w:lsdException w:name="Table List 2" w:semiHidden="1" w:unhideWhenUsed="1"/>
+    <w:lsdException w:name="Table List 3" w:semiHidden="1" w:unhideWhenUsed="1"/>
+    <w:lsdException w:name="Table List 4" w:semiHidden="1" w:unhideWhenUsed="1"/>
+    <w:lsdException w:name="Table List 5" w:semiHidden="1" w:unhideWhenUsed="1"/>
+    <w:lsdException w:name="Table List 6" w:semiHidden="1" w:unhideWhenUsed="1"/>
+    <w:lsdException w:name="Table List 7" w:semiHidden="1" w:unhideWhenUsed="1"/>
+    <w:lsdException w:name="Table List 8" w:semiHidden="1" w:unhideWhenUsed="1"/>
+    <w:lsdException w:name="Table 3D effects 1" w:semiHidden="1" w:unhideWhenUsed="1"/>
+    <w:lsdException w:name="Table 3D effects 2" w:semiHidden="1" w:unhideWhenUsed="1"/>
+    <w:lsdException w:name="Table 3D effects 3" w:semiHidden="1" w:unhideWhenUsed="1"/>
+    <w:lsdException w:name="Table Contemporary" w:semiHidden="1" w:unhideWhenUsed="1"/>
+    <w:lsdException w:name="Table Elegant" w:semiHidden="1" w:unhideWhenUsed="1"/>
+    <w:lsdException w:name="Table Professional" w:semiHidden="1" w:unhideWhenUsed="1"/>
+    <w:lsdException w:name="Table Subtle 1" w:semiHidden="1" w:unhideWhenUsed="1"/>
+    <w:lsdException w:name="Table Subtle 2" w:semiHidden="1" w:unhideWhenUsed="1"/>
+    <w:lsdException w:name="Table Web 1" w:semiHidden="1" w:unhideWhenUsed="1"/>
+    <w:lsdException w:name="Table Web 2" w:semiHidden="1" w:unhideWhenUsed="1"/>
+    <w:lsdException w:name="Table Web 3" w:semiHidden="1" w:unhideWhenUsed="1"/>
+    <w:lsdException w:name="Balloon Text" w:semiHidden="1" w:unhideWhenUsed="1"/>
+    <w:lsdException w:name="Table Grid" w:uiPriority="39"/>
+    <w:lsdException w:name="Table Theme" w:semiHidden="1" w:unhideWhenUsed="1"/>
+    <w:lsdException w:name="Placeholder Text" w:semiHidden="1"/>
+    <w:lsdException w:name="No Spacing" w:uiPriority="1" w:qFormat="1"/>
+    <w:lsdException w:name="Light Shading" w:uiPriority="60"/>
+    <w:lsdException w:name="Light List" w:uiPriority="61"/>
+    <w:lsdException w:name="Light Grid" w:uiPriority="62"/>
+    <w:lsdException w:name="Medium Shading 1" w:uiPriority="63"/>
+    <w:lsdException w:name="Medium Shading 2" w:uiPriority="64"/>
+    <w:lsdException w:name="Medium List 1" w:uiPriority="65"/>
+    <w:lsdException w:name="Medium List 2" w:uiPriority="66"/>
+    <w:lsdException w:name="Medium Grid 1" w:uiPriority="67"/>
+    <w:lsdException w:name="Medium Grid 2" w:uiPriority="68"/>
+    <w:lsdException w:name="Medium Grid 3" w:uiPriority="69"/>
+    <w:lsdException w:name="Dark List" w:uiPriority="70"/>
+    <w:lsdException w:name="Colorful Shading" w:uiPriority="71"/>
+    <w:lsdException w:name="Colorful List" w:uiPriority="72"/>
+    <w:lsdException w:name="Colorful Grid" w:uiPriority="73"/>
+    <w:lsdException w:name="Light Shading Accent 1" w:uiPriority="60"/>
+    <w:lsdException w:name="Light List Accent 1" w:uiPriority="61"/>
+    <w:lsdException w:name="Light Grid Accent 1" w:uiPriority="62"/>
+    <w:lsdException w:name="Medium Shading 1 Accent 1" w:uiPriority="63"/>
+    <w:lsdException w:name="Medium Shading 2 Accent 1" w:uiPriority="64"/>
+    <w:lsdException w:name="Medium List 1 Accent 1" w:uiPriority="65"/>
+    <w:lsdException w:name="Revision" w:semiHidden="1"/>
+    <w:lsdException w:name="List Paragraph" w:uiPriority="34" w:qFormat="1"/>
+    <w:lsdException w:name="Quote" w:uiPriority="29" w:qFormat="1"/>
+    <w:lsdException w:name="Intense Quote" w:uiPriority="30" w:qFormat="1"/>
+    <w:lsdException w:name="Medium List 2 Accent 1" w:uiPriority="66"/>
+    <w:lsdException w:name="Medium Grid 1 Accent 1" w:uiPriority="67"/>
+    <w:lsdException w:name="Medium Grid 2 Accent 1" w:uiPriority="68"/>
+    <w:lsdException w:name="Medium Grid 3 Accent 1" w:uiPriority="69"/>
+    <w:lsdException w:name="Dark List Accent 1" w:uiPriority="70"/>
+    <w:lsdException w:name="Colorful Shading Accent 1" w:uiPriority="71"/>
+    <w:lsdException w:name="Colorful List Accent 1" w:uiPriority="72"/>
+    <w:lsdException w:name="Colorful Grid Accent 1" w:uiPriority="73"/>
+    <w:lsdException w:name="Light Shading Accent 2" w:uiPriority="60"/>
+    <w:lsdException w:name="Light List Accent 2" w:uiPriority="61"/>
+    <w:lsdException w:name="Light Grid Accent 2" w:uiPriority="62"/>
+    <w:lsdException w:name="Medium Shading 1 Accent 2" w:uiPriority="63"/>
+    <w:lsdException w:name="Medium Shading 2 Accent 2" w:uiPriority="64"/>
+    <w:lsdException w:name="Medium List 1 Accent 2" w:uiPriority="65"/>
+    <w:lsdException w:name="Medium List 2 Accent 2" w:uiPriority="66"/>
+    <w:lsdException w:name="Medium Grid 1 Accent 2" w:uiPriority="67"/>
+    <w:lsdException w:name="Medium Grid 2 Accent 2" w:uiPriority="68"/>
+    <w:lsdException w:name="Medium Grid 3 Accent 2" w:uiPriority="69"/>
+    <w:lsdException w:name="Dark List Accent 2" w:uiPriority="70"/>
+    <w:lsdException w:name="Colorful Shading Accent 2" w:uiPriority="71"/>
+    <w:lsdException w:name="Colorful List Accent 2" w:uiPriority="72"/>
+    <w:lsdException w:name="Colorful Grid Accent 2" w:uiPriority="73"/>
+    <w:lsdException w:name="Light Shading Accent 3" w:uiPriority="60"/>
+    <w:lsdException w:name="Light List Accent 3" w:uiPriority="61"/>
+    <w:lsdException w:name="Light Grid Accent 3" w:uiPriority="62"/>
+    <w:lsdException w:name="Medium Shading 1 Accent 3" w:uiPriority="63"/>
+    <w:lsdException w:name="Medium Shading 2 Accent 3" w:uiPriority="64"/>
+    <w:lsdException w:name="Medium List 1 Accent 3" w:uiPriority="65"/>
+    <w:lsdException w:name="Medium List 2 Accent 3" w:uiPriority="66"/>
+    <w:lsdException w:name="Medium Grid 1 Accent 3" w:uiPriority="67"/>
+    <w:lsdException w:name="Medium Grid 2 Accent 3" w:uiPriority="68"/>
+    <w:lsdException w:name="Medium Grid 3 Accent 3" w:uiPriority="69"/>
+    <w:lsdException w:name="Dark List Accent 3" w:uiPriority="70"/>
+    <w:lsdException w:name="Colorful Shading Accent 3" w:uiPriority="71"/>
+    <w:lsdException w:name="Colorful List Accent 3" w:uiPriority="72"/>
+    <w:lsdException w:name="Colorful Grid Accent 3" w:uiPriority="73"/>
+    <w:lsdException w:name="Light Shading Accent 4" w:uiPriority="60"/>
+    <w:lsdException w:name="Light List Accent 4" w:uiPriority="61"/>
+    <w:lsdException w:name="Light Grid Accent 4" w:uiPriority="62"/>
+    <w:lsdException w:name="Medium Shading 1 Accent 4" w:uiPriority="63"/>
+    <w:lsdException w:name="Medium Shading 2 Accent 4" w:uiPriority="64"/>
+    <w:lsdException w:name="Medium List 1 Accent 4" w:uiPriority="65"/>
+    <w:lsdException w:name="Medium List 2 Accent 4" w:uiPriority="66"/>
+    <w:lsdException w:name="Medium Grid 1 Accent 4" w:uiPriority="67"/>
+    <w:lsdException w:name="Medium Grid 2 Accent 4" w:uiPriority="68"/>
+    <w:lsdException w:name="Medium Grid 3 Accent 4" w:uiPriority="69"/>
+    <w:lsdException w:name="Dark List Accent 4" w:uiPriority="70"/>
+    <w:lsdException w:name="Colorful Shading Accent 4" w:uiPriority="71"/>
+    <w:lsdException w:name="Colorful List Accent 4" w:uiPriority="72"/>
+    <w:lsdException w:name="Colorful Grid Accent 4" w:uiPriority="73"/>
+    <w:lsdException w:name="Light Shading Accent 5" w:uiPriority="60"/>
+    <w:lsdException w:name="Light List Accent 5" w:uiPriority="61"/>
+    <w:lsdException w:name="Light Grid Accent 5" w:uiPriority="62"/>
+    <w:lsdException w:name="Medium Shading 1 Accent 5" w:uiPriority="63"/>
+    <w:lsdException w:name="Medium Shading 2 Accent 5" w:uiPriority="64"/>
+    <w:lsdException w:name="Medium List 1 Accent 5" w:uiPriority="65"/>
+    <w:lsdException w:name="Medium List 2 Accent 5" w:uiPriority="66"/>
+    <w:lsdException w:name="Medium Grid 1 Accent 5" w:uiPriority="67"/>
+    <w:lsdException w:name="Medium Grid 2 Accent 5" w:uiPriority="68"/>
+    <w:lsdException w:name="Medium Grid 3 Accent 5" w:uiPriority="69"/>
+    <w:lsdException w:name="Dark List Accent 5" w:uiPriority="70"/>
+    <w:lsdException w:name="Colorful Shading Accent 5" w:uiPriority="71"/>
+    <w:lsdException w:name="Colorful List Accent 5" w:uiPriority="72"/>
+    <w:lsdException w:name="Colorful Grid Accent 5" w:uiPriority="73"/>
+    <w:lsdException w:name="Light Shading Accent 6" w:uiPriority="60"/>
+    <w:lsdException w:name="Light List Accent 6" w:uiPriority="61"/>
+    <w:lsdException w:name="Light Grid Accent 6" w:uiPriority="62"/>
+    <w:lsdException w:name="Medium Shading 1 Accent 6" w:uiPriority="63"/>
+    <w:lsdException w:name="Medium Shading 2 Accent 6" w:uiPriority="64"/>
+    <w:lsdException w:name="Medium List 1 Accent 6" w:uiPriority="65"/>
+    <w:lsdException w:name="Medium List 2 Accent 6" w:uiPriority="66"/>
+    <w:lsdException w:name="Medium Grid 1 Accent 6" w:uiPriority="67"/>
+    <w:lsdException w:name="Medium Grid 2 Accent 6" w:uiPriority="68"/>
+    <w:lsdException w:name="Medium Grid 3 Accent 6" w:uiPriority="69"/>
+    <w:lsdException w:name="Dark List Accent 6" w:uiPriority="70"/>
+    <w:lsdException w:name="Colorful Shading Accent 6" w:uiPriority="71"/>
+    <w:lsdException w:name="Colorful List Accent 6" w:uiPriority="72"/>
+    <w:lsdException w:name="Colorful Grid Accent 6" w:uiPriority="73"/>
+    <w:lsdException w:name="Subtle Emphasis" w:uiPriority="19" w:qFormat="1"/>
+    <w:lsdException w:name="Intense Emphasis" w:uiPriority="21" w:qFormat="1"/>
+    <w:lsdException w:name="Subtle Reference" w:uiPriority="31" w:qFormat="1"/>
+    <w:lsdException w:name="Intense Reference" w:uiPriority="32" w:qFormat="1"/>
+    <w:lsdException w:name="Book Title" w:uiPriority="33" w:qFormat="1"/>
+    <w:lsdException w:name="Bibliography" w:semiHidden="1" w:uiPriority="37" w:unhideWhenUsed="1"/>
+    <w:lsdException w:name="TOC Heading" w:semiHidden="1" w:uiPriority="39" w:unhideWhenUsed="1" w:qFormat="1"/>
+    <w:lsdException w:name="Plain Table 1" w:uiPriority="41"/>
+    <w:lsdException w:name="Plain Table 2" w:uiPriority="42"/>
+    <w:lsdException w:name="Plain Table 3" w:uiPriority="43"/>
+    <w:lsdException w:name="Plain Table 4" w:uiPriority="44"/>
+    <w:lsdException w:name="Plain Table 5" w:uiPriority="45"/>
+    <w:lsdException w:name="Grid Table Light" w:uiPriority="40"/>
+    <w:lsdException w:name="Grid Table 1 Light" w:uiPriority="46"/>
+    <w:lsdException w:name="Grid Table 2" w:uiPriority="47"/>
+    <w:lsdException w:name="Grid Table 3" w:uiPriority="48"/>
+    <w:lsdException w:name="Grid Table 4" w:uiPriority="49"/>
+    <w:lsdException w:name="Grid Table 5 Dark" w:uiPriority="50"/>
+    <w:lsdException w:name="Grid Table 6 Colorful" w:uiPriority="51"/>
+    <w:lsdException w:name="Grid Table 7 Colorful" w:uiPriority="52"/>
+    <w:lsdException w:name="Grid Table 1 Light Accent 1" w:uiPriority="46"/>
+    <w:lsdException w:name="Grid Table 2 Accent 1" w:uiPriority="47"/>
+    <w:lsdException w:name="Grid Table 3 Accent 1" w:uiPriority="48"/>
+    <w:lsdException w:name="Grid Table 4 Accent 1" w:uiPriority="49"/>
+    <w:lsdException w:name="Grid Table 5 Dark Accent 1" w:uiPriority="50"/>
+    <w:lsdException w:name="Grid Table 6 Colorful Accent 1" w:uiPriority="51"/>
+    <w:lsdException w:name="Grid Table 7 Colorful Accent 1" w:uiPriority="52"/>
+    <w:lsdException w:name="Grid Table 1 Light Accent 2" w:uiPriority="46"/>
+    <w:lsdException w:name="Grid Table 2 Accent 2" w:uiPriority="47"/>
+    <w:lsdException w:name="Grid Table 3 Accent 2" w:uiPriority="48"/>
+    <w:lsdException w:name="Grid Table 4 Accent 2" w:uiPriority="49"/>
+    <w:lsdException w:name="Grid Table 5 Dark Accent 2" w:uiPriority="50"/>
+    <w:lsdException w:name="Grid Table 6 Colorful Accent 2" w:uiPriority="51"/>
+    <w:lsdException w:name="Grid Table 7 Colorful Accent 2" w:uiPriority="52"/>
+    <w:lsdException w:name="Grid Table 1 Light Accent 3" w:uiPriority="46"/>
+    <w:lsdException w:name="Grid Table 2 Accent 3" w:uiPriority="47"/>
+    <w:lsdException w:name="Grid Table 3 Accent 3" w:uiPriority="48"/>
+    <w:lsdException w:name="Grid Table 4 Accent 3" w:uiPriority="49"/>
+    <w:lsdException w:name="Grid Table 5 Dark Accent 3" w:uiPriority="50"/>
+    <w:lsdException w:name="Grid Table 6 Colorful Accent 3" w:uiPriority="51"/>
+    <w:lsdException w:name="Grid Table 7 Colorful Accent 3" w:uiPriority="52"/>
+    <w:lsdException w:name="Grid Table 1 Light Accent 4" w:uiPriority="46"/>
+    <w:lsdException w:name="Grid Table 2 Accent 4" w:uiPriority="47"/>
+    <w:lsdException w:name="Grid Table 3 Accent 4" w:uiPriority="48"/>
+    <w:lsdException w:name="Grid Table 4 Accent 4" w:uiPriority="49"/>
+    <w:lsdException w:name="Grid Table 5 Dark Accent 4" w:uiPriority="50"/>
+    <w:lsdException w:name="Grid Table 6 Colorful Accent 4" w:uiPriority="51"/>
+    <w:lsdException w:name="Grid Table 7 Colorful Accent 4" w:uiPriority="52"/>
+    <w:lsdException w:name="Grid Table 1 Light Accent 5" w:uiPriority="46"/>
+    <w:lsdException w:name="Grid Table 2 Accent 5" w:uiPriority="47"/>
+    <w:lsdException w:name="Grid Table 3 Accent 5" w:uiPriority="48"/>
+    <w:lsdException w:name="Grid Table 4 Accent 5" w:uiPriority="49"/>
+    <w:lsdException w:name="Grid Table 5 Dark Accent 5" w:uiPriority="50"/>
+    <w:lsdException w:name="Grid Table 6 Colorful Accent 5" w:uiPriority="51"/>
+    <w:lsdException w:name="Grid Table 7 Colorful Accent 5" w:uiPriority="52"/>
+    <w:lsdException w:name="Grid Table 1 Light Accent 6" w:uiPriority="46"/>
+    <w:lsdException w:name="Grid Table 2 Accent 6" w:uiPriority="47"/>
+    <w:lsdException w:name="Grid Table 3 Accent 6" w:uiPriority="48"/>
+    <w:lsdException w:name="Grid Table 4 Accent 6" w:uiPriority="49"/>
+    <w:lsdException w:name="Grid Table 5 Dark Accent 6" w:uiPriority="50"/>
+    <w:lsdException w:name="Grid Table 6 Colorful Accent 6" w:uiPriority="51"/>
+    <w:lsdException w:name="Grid Table 7 Colorful Accent 6" w:uiPriority="52"/>
+    <w:lsdException w:name="List Table 1 Light" w:uiPriority="46"/>
+    <w:lsdException w:name="List Table 2" w:uiPriority="47"/>
+    <w:lsdException w:name="List Table 3" w:uiPriority="48"/>
+    <w:lsdException w:name="List Table 4" w:uiPriority="49"/>
+    <w:lsdException w:name="List Table 5 Dark" w:uiPriority="50"/>
+    <w:lsdException w:name="List Table 6 Colorful" w:uiPriority="51"/>
+    <w:lsdException w:name="List Table 7 Colorful" w:uiPriority="52"/>
+    <w:lsdException w:name="List Table 1 Light Accent 1" w:uiPriority="46"/>
+    <w:lsdException w:name="List Table 2 Accent 1" w:uiPriority="47"/>
+    <w:lsdException w:name="List Table 3 Accent 1" w:uiPriority="48"/>
+    <w:lsdException w:name="List Table 4 Accent 1" w:uiPriority="49"/>
+    <w:lsdException w:name="List Table 5 Dark Accent 1" w:uiPriority="50"/>
+    <w:lsdException w:name="List Table 6 Colorful Accent 1" w:uiPriority="51"/>
+    <w:lsdException w:name="List Table 7 Colorful Accent 1" w:uiPriority="52"/>
+    <w:lsdException w:name="List Table 1 Light Accent 2" w:uiPriority="46"/>
+    <w:lsdException w:name="List Table 2 Accent 2" w:uiPriority="47"/>
+    <w:lsdException w:name="List Table 3 Accent 2" w:uiPriority="48"/>
+    <w:lsdException w:name="List Table 4 Accent 2" w:uiPriority="49"/>
+    <w:lsdException w:name="List Table 5 Dark Accent 2" w:uiPriority="50"/>
+    <w:lsdException w:name="List Table 6 Colorful Accent 2" w:uiPriority="51"/>
+    <w:lsdException w:name="List Table 7 Colorful Accent 2" w:uiPriority="52"/>
+    <w:lsdException w:name="List Table 1 Light Accent 3" w:uiPriority="46"/>
+    <w:lsdException w:name="List Table 2 Accent 3" w:uiPriority="47"/>
+    <w:lsdException w:name="List Table 3 Accent 3" w:uiPriority="48"/>
+    <w:lsdException w:name="List Table 4 Accent 3" w:uiPriority="49"/>
+    <w:lsdException w:name="List Table 5 Dark Accent 3" w:uiPriority="50"/>
+    <w:lsdException w:name="List Table 6 Colorful Accent 3" w:uiPriority="51"/>
+    <w:lsdException w:name="List Table 7 Colorful Accent 3" w:uiPriority="52"/>
+    <w:lsdException w:name="List Table 1 Light Accent 4" w:uiPriority="46"/>
+    <w:lsdException w:name="List Table 2 Accent 4" w:uiPriority="47"/>
+    <w:lsdException w:name="List Table 3 Accent 4" w:uiPriority="48"/>
+    <w:lsdException w:name="List Table 4 Accent 4" w:uiPriority="49"/>
+    <w:lsdException w:name="List Table 5 Dark Accent 4" w:uiPriority="50"/>
+    <w:lsdException w:name="List Table 6 Colorful Accent 4" w:uiPriority="51"/>
+    <w:lsdException w:name="List Table 7 Colorful Accent 4" w:uiPriority="52"/>
+    <w:lsdException w:name="List Table 1 Light Accent 5" w:uiPriority="46"/>
+    <w:lsdException w:name="List Table 2 Accent 5" w:uiPriority="47"/>
+    <w:lsdException w:name="List Table 3 Accent 5" w:uiPriority="48"/>
+    <w:lsdException w:name="List Table 4 Accent 5" w:uiPriority="49"/>
+    <w:lsdException w:name="List Table 5 Dark Accent 5" w:uiPriority="50"/>
+    <w:lsdException w:name="List Table 6 Colorful Accent 5" w:uiPriority="51"/>
+    <w:lsdException w:name="List Table 7 Colorful Accent 5" w:uiPriority="52"/>
+    <w:lsdException w:name="List Table 1 Light Accent 6" w:uiPriority="46"/>
+    <w:lsdException w:name="List Table 2 Accent 6" w:uiPriority="47"/>
+    <w:lsdException w:name="List Table 3 Accent 6" w:uiPriority="48"/>
+    <w:lsdException w:name="List Table 4 Accent 6" w:uiPriority="49"/>
+    <w:lsdException w:name="List Table 5 Dark Accent 6" w:uiPriority="50"/>
+    <w:lsdException w:name="List Table 6 Colorful Accent 6" w:uiPriority="51"/>
+    <w:lsdException w:name="List Table 7 Colorful Accent 6" w:uiPriority="52"/>
+    <w:lsdException w:name="Mention" w:semiHidden="1" w:unhideWhenUsed="1"/>
+    <w:lsdException w:name="Smart Hyperlink" w:semiHidden="1" w:unhideWhenUsed="1"/>
+    <w:lsdException w:name="Hashtag" w:semiHidden="1" w:unhideWhenUsed="1"/>
+    <w:lsdException w:name="Unresolved Mention" w:semiHidden="1" w:unhideWhenUsed="1"/>
+    <w:lsdException w:name="Smart Link" w:semiHidden="1" w:unhideWhenUsed="1"/>
+  </w:latentStyles>
+  <w:style w:type="paragraph" w:default="1" w:styleId="Normal">
+    <w:name w:val="Normal"/>
     <w:qFormat/>
-    <w:rPr>
-      <w:sz w:val="56"/>
-      <w:szCs w:val="56"/>
-    </w:rPr>
   </w:style>
   <w:style w:type="paragraph" w:styleId="Heading1">
-    <w:name w:val="Heading 1"/>
-    <w:basedOn w:val="Normal"/>
-    <w:next w:val="Normal"/>
+    <w:name w:val="heading 1"/>
+    <w:uiPriority w:val="9"/>
     <w:qFormat/>
+    <w:pPr>
+      <w:outlineLvl w:val="0"/>
+    </w:pPr>
     <w:rPr>
       <w:color w:val="2E74B5"/>
       <w:sz w:val="32"/>
@@ -2140,10 +2390,14 @@
     </w:rPr>
   </w:style>
   <w:style w:type="paragraph" w:styleId="Heading2">
-    <w:name w:val="Heading 2"/>
-    <w:basedOn w:val="Normal"/>
-    <w:next w:val="Normal"/>
+    <w:name w:val="heading 2"/>
+    <w:uiPriority w:val="9"/>
+    <w:semiHidden/>
+    <w:unhideWhenUsed/>
     <w:qFormat/>
+    <w:pPr>
+      <w:outlineLvl w:val="1"/>
+    </w:pPr>
     <w:rPr>
       <w:color w:val="2E74B5"/>
       <w:sz w:val="26"/>
@@ -2151,10 +2405,14 @@
     </w:rPr>
   </w:style>
   <w:style w:type="paragraph" w:styleId="Heading3">
-    <w:name w:val="Heading 3"/>
-    <w:basedOn w:val="Normal"/>
-    <w:next w:val="Normal"/>
+    <w:name w:val="heading 3"/>
+    <w:uiPriority w:val="9"/>
+    <w:semiHidden/>
+    <w:unhideWhenUsed/>
     <w:qFormat/>
+    <w:pPr>
+      <w:outlineLvl w:val="2"/>
+    </w:pPr>
     <w:rPr>
       <w:color w:val="1F4D78"/>
       <w:sz w:val="24"/>
@@ -2162,10 +2420,14 @@
     </w:rPr>
   </w:style>
   <w:style w:type="paragraph" w:styleId="Heading4">
-    <w:name w:val="Heading 4"/>
-    <w:basedOn w:val="Normal"/>
-    <w:next w:val="Normal"/>
+    <w:name w:val="heading 4"/>
+    <w:uiPriority w:val="9"/>
+    <w:semiHidden/>
+    <w:unhideWhenUsed/>
     <w:qFormat/>
+    <w:pPr>
+      <w:outlineLvl w:val="3"/>
+    </w:pPr>
     <w:rPr>
       <w:i/>
       <w:iCs/>
@@ -2173,27 +2435,69 @@
     </w:rPr>
   </w:style>
   <w:style w:type="paragraph" w:styleId="Heading5">
-    <w:name w:val="Heading 5"/>
-    <w:basedOn w:val="Normal"/>
-    <w:next w:val="Normal"/>
+    <w:name w:val="heading 5"/>
+    <w:uiPriority w:val="9"/>
+    <w:semiHidden/>
+    <w:unhideWhenUsed/>
     <w:qFormat/>
+    <w:pPr>
+      <w:outlineLvl w:val="4"/>
+    </w:pPr>
     <w:rPr>
       <w:color w:val="2E74B5"/>
     </w:rPr>
   </w:style>
   <w:style w:type="paragraph" w:styleId="Heading6">
-    <w:name w:val="Heading 6"/>
-    <w:basedOn w:val="Normal"/>
-    <w:next w:val="Normal"/>
+    <w:name w:val="heading 6"/>
+    <w:uiPriority w:val="9"/>
+    <w:semiHidden/>
+    <w:unhideWhenUsed/>
     <w:qFormat/>
+    <w:pPr>
+      <w:outlineLvl w:val="5"/>
+    </w:pPr>
     <w:rPr>
       <w:color w:val="1F4D78"/>
     </w:rPr>
   </w:style>
-  <w:style w:type="paragraph" w:styleId="Strong">
-    <w:name w:val="Strong"/>
-    <w:basedOn w:val="Normal"/>
-    <w:next w:val="Normal"/>
+  <w:style w:type="character" w:default="1" w:styleId="DefaultParagraphFont">
+    <w:name w:val="Default Paragraph Font"/>
+    <w:uiPriority w:val="1"/>
+    <w:semiHidden/>
+    <w:unhideWhenUsed/>
+  </w:style>
+  <w:style w:type="table" w:default="1" w:styleId="TableNormal">
+    <w:name w:val="Normal Table"/>
+    <w:uiPriority w:val="99"/>
+    <w:semiHidden/>
+    <w:unhideWhenUsed/>
+    <w:tblPr>
+      <w:tblInd w:w="0" w:type="dxa"/>
+      <w:tblCellMar>
+        <w:top w:w="0" w:type="dxa"/>
+        <w:left w:w="108" w:type="dxa"/>
+        <w:bottom w:w="0" w:type="dxa"/>
+        <w:right w:w="108" w:type="dxa"/>
+      </w:tblCellMar>
+    </w:tblPr>
+  </w:style>
+  <w:style w:type="numbering" w:default="1" w:styleId="NoList">
+    <w:name w:val="No List"/>
+    <w:uiPriority w:val="99"/>
+    <w:semiHidden/>
+    <w:unhideWhenUsed/>
+  </w:style>
+  <w:style w:type="paragraph" w:styleId="Title">
+    <w:name w:val="Title"/>
+    <w:uiPriority w:val="10"/>
+    <w:qFormat/>
+    <w:rPr>
+      <w:sz w:val="56"/>
+      <w:szCs w:val="56"/>
+    </w:rPr>
+  </w:style>
+  <w:style w:type="paragraph" w:customStyle="1" w:styleId="Strong1">
+    <w:name w:val="Strong1"/>
     <w:qFormat/>
     <w:rPr>
       <w:b/>
@@ -2202,12 +2506,10 @@
   </w:style>
   <w:style w:type="paragraph" w:styleId="ListParagraph">
     <w:name w:val="List Paragraph"/>
-    <w:basedOn w:val="Normal"/>
     <w:qFormat/>
   </w:style>
   <w:style w:type="character" w:styleId="Hyperlink">
     <w:name w:val="Hyperlink"/>
-    <w:basedOn w:val="DefaultParagraphFont"/>
     <w:uiPriority w:val="99"/>
     <w:unhideWhenUsed/>
     <w:rPr>
@@ -2217,7 +2519,6 @@
   </w:style>
   <w:style w:type="character" w:styleId="FootnoteReference">
     <w:name w:val="footnote reference"/>
-    <w:basedOn w:val="DefaultParagraphFont"/>
     <w:uiPriority w:val="99"/>
     <w:semiHidden/>
     <w:unhideWhenUsed/>
@@ -2227,22 +2528,13 @@
   </w:style>
   <w:style w:type="paragraph" w:styleId="FootnoteText">
     <w:name w:val="footnote text"/>
-    <w:basedOn w:val="Normal"/>
     <w:link w:val="FootnoteTextChar"/>
     <w:uiPriority w:val="99"/>
     <w:semiHidden/>
     <w:unhideWhenUsed/>
-    <w:pPr>
-      <w:spacing w:after="0" w:line="240" w:lineRule="auto"/>
-    </w:pPr>
-    <w:rPr>
-      <w:sz w:val="20"/>
-      <w:szCs w:val="20"/>
-    </w:rPr>
   </w:style>
-  <w:style w:type="character" w:styleId="FootnoteTextChar">
+  <w:style w:type="character" w:customStyle="1" w:styleId="FootnoteTextChar">
     <w:name w:val="Footnote Text Char"/>
-    <w:basedOn w:val="DefaultParagraphFont"/>
     <w:link w:val="FootnoteText"/>
     <w:uiPriority w:val="99"/>
     <w:semiHidden/>
@@ -2254,7 +2546,6 @@
   </w:style>
   <w:style w:type="character" w:styleId="EndnoteReference">
     <w:name w:val="endnote reference"/>
-    <w:basedOn w:val="DefaultParagraphFont"/>
     <w:uiPriority w:val="99"/>
     <w:semiHidden/>
     <w:unhideWhenUsed/>
@@ -2264,22 +2555,13 @@
   </w:style>
   <w:style w:type="paragraph" w:styleId="EndnoteText">
     <w:name w:val="endnote text"/>
-    <w:basedOn w:val="Normal"/>
     <w:link w:val="EndnoteTextChar"/>
     <w:uiPriority w:val="99"/>
     <w:semiHidden/>
     <w:unhideWhenUsed/>
-    <w:pPr>
-      <w:spacing w:after="0" w:line="240" w:lineRule="auto"/>
-    </w:pPr>
-    <w:rPr>
-      <w:sz w:val="20"/>
-      <w:szCs w:val="20"/>
-    </w:rPr>
   </w:style>
-  <w:style w:type="character" w:styleId="EndnoteTextChar">
+  <w:style w:type="character" w:customStyle="1" w:styleId="EndnoteTextChar">
     <w:name w:val="Endnote Text Char"/>
-    <w:basedOn w:val="DefaultParagraphFont"/>
     <w:link w:val="EndnoteText"/>
     <w:uiPriority w:val="99"/>
     <w:semiHidden/>
@@ -2290,4 +2572,299 @@
     </w:rPr>
   </w:style>
 </w:styles>
+</file>
+
+<file path=word/theme/theme1.xml><?xml version="1.0" encoding="utf-8"?>
+<a:theme xmlns:a="http://schemas.openxmlformats.org/drawingml/2006/main" name="Office Theme">
+  <a:themeElements>
+    <a:clrScheme name="Office">
+      <a:dk1>
+        <a:sysClr val="windowText" lastClr="000000"/>
+      </a:dk1>
+      <a:lt1>
+        <a:sysClr val="window" lastClr="FFFFFF"/>
+      </a:lt1>
+      <a:dk2>
+        <a:srgbClr val="44546A"/>
+      </a:dk2>
+      <a:lt2>
+        <a:srgbClr val="E7E6E6"/>
+      </a:lt2>
+      <a:accent1>
+        <a:srgbClr val="4472C4"/>
+      </a:accent1>
+      <a:accent2>
+        <a:srgbClr val="ED7D31"/>
+      </a:accent2>
+      <a:accent3>
+        <a:srgbClr val="A5A5A5"/>
+      </a:accent3>
+      <a:accent4>
+        <a:srgbClr val="FFC000"/>
+      </a:accent4>
+      <a:accent5>
+        <a:srgbClr val="5B9BD5"/>
+      </a:accent5>
+      <a:accent6>
+        <a:srgbClr val="70AD47"/>
+      </a:accent6>
+      <a:hlink>
+        <a:srgbClr val="0563C1"/>
+      </a:hlink>
+      <a:folHlink>
+        <a:srgbClr val="954F72"/>
+      </a:folHlink>
+    </a:clrScheme>
+    <a:fontScheme name="Office">
+      <a:majorFont>
+        <a:latin typeface="Calibri Light" panose="020F0302020204030204"/>
+        <a:ea typeface=""/>
+        <a:cs typeface=""/>
+        <a:font script="Jpan" typeface="游ゴシック Light"/>
+        <a:font script="Hang" typeface="맑은 고딕"/>
+        <a:font script="Hans" typeface="等线 Light"/>
+        <a:font script="Hant" typeface="新細明體"/>
+        <a:font script="Arab" typeface="Times New Roman"/>
+        <a:font script="Hebr" typeface="Times New Roman"/>
+        <a:font script="Thai" typeface="Angsana New"/>
+        <a:font script="Ethi" typeface="Nyala"/>
+        <a:font script="Beng" typeface="Vrinda"/>
+        <a:font script="Gujr" typeface="Shruti"/>
+        <a:font script="Khmr" typeface="MoolBoran"/>
+        <a:font script="Knda" typeface="Tunga"/>
+        <a:font script="Guru" typeface="Raavi"/>
+        <a:font script="Cans" typeface="Euphemia"/>
+        <a:font script="Cher" typeface="Plantagenet Cherokee"/>
+        <a:font script="Yiii" typeface="Microsoft Yi Baiti"/>
+        <a:font script="Tibt" typeface="Microsoft Himalaya"/>
+        <a:font script="Thaa" typeface="MV Boli"/>
+        <a:font script="Deva" typeface="Mangal"/>
+        <a:font script="Telu" typeface="Gautami"/>
+        <a:font script="Taml" typeface="Latha"/>
+        <a:font script="Syrc" typeface="Estrangelo Edessa"/>
+        <a:font script="Orya" typeface="Kalinga"/>
+        <a:font script="Mlym" typeface="Kartika"/>
+        <a:font script="Laoo" typeface="DokChampa"/>
+        <a:font script="Sinh" typeface="Iskoola Pota"/>
+        <a:font script="Mong" typeface="Mongolian Baiti"/>
+        <a:font script="Viet" typeface="Times New Roman"/>
+        <a:font script="Uigh" typeface="Microsoft Uighur"/>
+        <a:font script="Geor" typeface="Sylfaen"/>
+        <a:font script="Armn" typeface="Arial"/>
+        <a:font script="Bugi" typeface="Leelawadee UI"/>
+        <a:font script="Bopo" typeface="Microsoft JhengHei"/>
+        <a:font script="Java" typeface="Javanese Text"/>
+        <a:font script="Lisu" typeface="Segoe UI"/>
+        <a:font script="Mymr" typeface="Myanmar Text"/>
+        <a:font script="Nkoo" typeface="Ebrima"/>
+        <a:font script="Olck" typeface="Nirmala UI"/>
+        <a:font script="Osma" typeface="Ebrima"/>
+        <a:font script="Phag" typeface="Phagspa"/>
+        <a:font script="Syrn" typeface="Estrangelo Edessa"/>
+        <a:font script="Syrj" typeface="Estrangelo Edessa"/>
+        <a:font script="Syre" typeface="Estrangelo Edessa"/>
+        <a:font script="Sora" typeface="Nirmala UI"/>
+        <a:font script="Tale" typeface="Microsoft Tai Le"/>
+        <a:font script="Talu" typeface="Microsoft New Tai Lue"/>
+        <a:font script="Tfng" typeface="Ebrima"/>
+      </a:majorFont>
+      <a:minorFont>
+        <a:latin typeface="Calibri" panose="020F0502020204030204"/>
+        <a:ea typeface=""/>
+        <a:cs typeface=""/>
+        <a:font script="Jpan" typeface="游明朝"/>
+        <a:font script="Hang" typeface="맑은 고딕"/>
+        <a:font script="Hans" typeface="等线"/>
+        <a:font script="Hant" typeface="新細明體"/>
+        <a:font script="Arab" typeface="Arial"/>
+        <a:font script="Hebr" typeface="Arial"/>
+        <a:font script="Thai" typeface="Cordia New"/>
+        <a:font script="Ethi" typeface="Nyala"/>
+        <a:font script="Beng" typeface="Vrinda"/>
+        <a:font script="Gujr" typeface="Shruti"/>
+        <a:font script="Khmr" typeface="DaunPenh"/>
+        <a:font script="Knda" typeface="Tunga"/>
+        <a:font script="Guru" typeface="Raavi"/>
+        <a:font script="Cans" typeface="Euphemia"/>
+        <a:font script="Cher" typeface="Plantagenet Cherokee"/>
+        <a:font script="Yiii" typeface="Microsoft Yi Baiti"/>
+        <a:font script="Tibt" typeface="Microsoft Himalaya"/>
+        <a:font script="Thaa" typeface="MV Boli"/>
+        <a:font script="Deva" typeface="Mangal"/>
+        <a:font script="Telu" typeface="Gautami"/>
+        <a:font script="Taml" typeface="Latha"/>
+        <a:font script="Syrc" typeface="Estrangelo Edessa"/>
+        <a:font script="Orya" typeface="Kalinga"/>
+        <a:font script="Mlym" typeface="Kartika"/>
+        <a:font script="Laoo" typeface="DokChampa"/>
+        <a:font script="Sinh" typeface="Iskoola Pota"/>
+        <a:font script="Mong" typeface="Mongolian Baiti"/>
+        <a:font script="Viet" typeface="Arial"/>
+        <a:font script="Uigh" typeface="Microsoft Uighur"/>
+        <a:font script="Geor" typeface="Sylfaen"/>
+        <a:font script="Armn" typeface="Arial"/>
+        <a:font script="Bugi" typeface="Leelawadee UI"/>
+        <a:font script="Bopo" typeface="Microsoft JhengHei"/>
+        <a:font script="Java" typeface="Javanese Text"/>
+        <a:font script="Lisu" typeface="Segoe UI"/>
+        <a:font script="Mymr" typeface="Myanmar Text"/>
+        <a:font script="Nkoo" typeface="Ebrima"/>
+        <a:font script="Olck" typeface="Nirmala UI"/>
+        <a:font script="Osma" typeface="Ebrima"/>
+        <a:font script="Phag" typeface="Phagspa"/>
+        <a:font script="Syrn" typeface="Estrangelo Edessa"/>
+        <a:font script="Syrj" typeface="Estrangelo Edessa"/>
+        <a:font script="Syre" typeface="Estrangelo Edessa"/>
+        <a:font script="Sora" typeface="Nirmala UI"/>
+        <a:font script="Tale" typeface="Microsoft Tai Le"/>
+        <a:font script="Talu" typeface="Microsoft New Tai Lue"/>
+        <a:font script="Tfng" typeface="Ebrima"/>
+      </a:minorFont>
+    </a:fontScheme>
+    <a:fmtScheme name="Office">
+      <a:fillStyleLst>
+        <a:solidFill>
+          <a:schemeClr val="phClr"/>
+        </a:solidFill>
+        <a:gradFill rotWithShape="1">
+          <a:gsLst>
+            <a:gs pos="0">
+              <a:schemeClr val="phClr">
+                <a:lumMod val="110000"/>
+                <a:satMod val="105000"/>
+                <a:tint val="67000"/>
+              </a:schemeClr>
+            </a:gs>
+            <a:gs pos="50000">
+              <a:schemeClr val="phClr">
+                <a:lumMod val="105000"/>
+                <a:satMod val="103000"/>
+                <a:tint val="73000"/>
+              </a:schemeClr>
+            </a:gs>
+            <a:gs pos="100000">
+              <a:schemeClr val="phClr">
+                <a:lumMod val="105000"/>
+                <a:satMod val="109000"/>
+                <a:tint val="81000"/>
+              </a:schemeClr>
+            </a:gs>
+          </a:gsLst>
+          <a:lin ang="5400000" scaled="0"/>
+        </a:gradFill>
+        <a:gradFill rotWithShape="1">
+          <a:gsLst>
+            <a:gs pos="0">
+              <a:schemeClr val="phClr">
+                <a:satMod val="103000"/>
+                <a:lumMod val="102000"/>
+                <a:tint val="94000"/>
+              </a:schemeClr>
+            </a:gs>
+            <a:gs pos="50000">
+              <a:schemeClr val="phClr">
+                <a:satMod val="110000"/>
+                <a:lumMod val="100000"/>
+                <a:shade val="100000"/>
+              </a:schemeClr>
+            </a:gs>
+            <a:gs pos="100000">
+              <a:schemeClr val="phClr">
+                <a:lumMod val="99000"/>
+                <a:satMod val="120000"/>
+                <a:shade val="78000"/>
+              </a:schemeClr>
+            </a:gs>
+          </a:gsLst>
+          <a:lin ang="5400000" scaled="0"/>
+        </a:gradFill>
+      </a:fillStyleLst>
+      <a:lnStyleLst>
+        <a:ln w="6350" cap="flat" cmpd="sng" algn="ctr">
+          <a:solidFill>
+            <a:schemeClr val="phClr"/>
+          </a:solidFill>
+          <a:prstDash val="solid"/>
+          <a:miter lim="800000"/>
+        </a:ln>
+        <a:ln w="12700" cap="flat" cmpd="sng" algn="ctr">
+          <a:solidFill>
+            <a:schemeClr val="phClr"/>
+          </a:solidFill>
+          <a:prstDash val="solid"/>
+          <a:miter lim="800000"/>
+        </a:ln>
+        <a:ln w="19050" cap="flat" cmpd="sng" algn="ctr">
+          <a:solidFill>
+            <a:schemeClr val="phClr"/>
+          </a:solidFill>
+          <a:prstDash val="solid"/>
+          <a:miter lim="800000"/>
+        </a:ln>
+      </a:lnStyleLst>
+      <a:effectStyleLst>
+        <a:effectStyle>
+          <a:effectLst/>
+        </a:effectStyle>
+        <a:effectStyle>
+          <a:effectLst/>
+        </a:effectStyle>
+        <a:effectStyle>
+          <a:effectLst>
+            <a:outerShdw blurRad="57150" dist="19050" dir="5400000" algn="ctr" rotWithShape="0">
+              <a:srgbClr val="000000">
+                <a:alpha val="63000"/>
+              </a:srgbClr>
+            </a:outerShdw>
+          </a:effectLst>
+        </a:effectStyle>
+      </a:effectStyleLst>
+      <a:bgFillStyleLst>
+        <a:solidFill>
+          <a:schemeClr val="phClr"/>
+        </a:solidFill>
+        <a:solidFill>
+          <a:schemeClr val="phClr">
+            <a:tint val="95000"/>
+            <a:satMod val="170000"/>
+          </a:schemeClr>
+        </a:solidFill>
+        <a:gradFill rotWithShape="1">
+          <a:gsLst>
+            <a:gs pos="0">
+              <a:schemeClr val="phClr">
+                <a:tint val="93000"/>
+                <a:satMod val="150000"/>
+                <a:shade val="98000"/>
+                <a:lumMod val="102000"/>
+              </a:schemeClr>
+            </a:gs>
+            <a:gs pos="50000">
+              <a:schemeClr val="phClr">
+                <a:tint val="98000"/>
+                <a:satMod val="130000"/>
+                <a:shade val="90000"/>
+                <a:lumMod val="103000"/>
+              </a:schemeClr>
+            </a:gs>
+            <a:gs pos="100000">
+              <a:schemeClr val="phClr">
+                <a:shade val="63000"/>
+                <a:satMod val="120000"/>
+              </a:schemeClr>
+            </a:gs>
+          </a:gsLst>
+          <a:lin ang="5400000" scaled="0"/>
+        </a:gradFill>
+      </a:bgFillStyleLst>
+    </a:fmtScheme>
+  </a:themeElements>
+  <a:objectDefaults/>
+  <a:extraClrSchemeLst/>
+  <a:extLst>
+    <a:ext uri="{05A4C25C-085E-4340-85A3-A5531E510DB2}">
+      <thm15:themeFamily xmlns:thm15="http://schemas.microsoft.com/office/thememl/2012/main" name="Office Theme" id="{62F939B6-93AF-4DB8-9C6B-D6C7DFDC589F}" vid="{4A3C46E8-61CC-4603-A589-7422A47A8E4A}"/>
+    </a:ext>
+  </a:extLst>
+</a:theme>
 </file>
</xml_diff>